<commit_message>
Lavoro giugno: preventivo online, bonifico, lingua IT/EN, refactor catalogo
Mette in sicurezza ~4 giorni di lavoro non committato (dal commit vuoto del 1 giu).

- Portale: conferma preventivo online (quote_confirm + PDF preventivo)
- Checkout: pagamento con bonifico bancario
- Portale: cambio lingua IT/EN (i18n, locale/en, selettore in login)
- Catalogo: nuovi modelli CatalogService/ServiceCategory/ServiceInclusion,
  import da Excel (importa_catalogo), migrazioni 0007-0009
- Eventi: campo venue_name (migrazione 0005)
- Contratti: template 'domanda di ammissione', filtro contatto in admin
- Aggiunto Pillow a requirements.txt (dipendenza mancante: ImageField)
- Aggiunto CLAUDE.md (guida per dev)

App verificata funzionante: check pulito, migrazioni applicate, server ok.

Co-Authored-By: Claude Opus 4.8 <noreply@anthropic.com>
</commit_message>
<xml_diff>
--- a/contracts/templates_pdf/template_ecm_it.docx
+++ b/contracts/templates_pdf/template_ecm_it.docx
@@ -7657,2097 +7657,1416 @@
       </w:pPr>
     </w:p>
     <w:p>
-      <w:r>
-        <w:br w:type="page"/>
-      </w:r>
-    </w:p>
-    <w:p>
-      <w:pPr>
+      <w:pPr>
+        <w:pageBreakBefore/>
+        <w:keepLines/>
+        <w:keepNext/>
+        <w:spacing w:line="240" w:lineRule="auto" w:before="40" w:after="40"/>
+        <w:ind w:right="56"/>
+        <w:jc w:val="center"/>
+        <w:rPr>
+          <w:rFonts w:ascii="Arial" w:hAnsi="Arial" w:cs="Arial"/>
+          <w:b/>
+        </w:rPr>
+      </w:pPr>
+      <w:r>
+        <w:rPr>
+          <w:rFonts w:ascii="Calibri" w:hAnsi="Calibri" w:cs="Calibri"/>
+          <w:b/>
+        </w:rPr>
+        <w:t>ALLEGATO 2)</w:t>
+      </w:r>
+    </w:p>
+    <w:p>
+      <w:pPr>
+        <w:spacing w:before="40" w:after="40" w:line="240" w:lineRule="auto"/>
         <w:jc w:val="both"/>
         <w:rPr>
-          <w:rFonts w:ascii="Century Gothic" w:hAnsi="Century Gothic" w:cs="Century Gothic"/>
+          <w:rFonts w:ascii="Arial" w:hAnsi="Arial" w:cs="Arial"/>
+          <w:b/>
+        </w:rPr>
+      </w:pPr>
+    </w:p>
+    <w:p>
+      <w:pPr>
+        <w:keepLines/>
+        <w:keepNext/>
+        <w:adjustRightInd w:val="0"/>
+        <w:spacing w:before="40" w:after="40" w:line="240" w:lineRule="auto"/>
+        <w:jc w:val="both"/>
+        <w:rPr>
+          <w:rFonts w:ascii="Arial" w:hAnsi="Arial" w:cs="Arial"/>
+          <w:b/>
+        </w:rPr>
+      </w:pPr>
+      <w:r>
+        <w:rPr>
+          <w:rFonts w:ascii="Calibri" w:hAnsi="Calibri" w:cs="Calibri"/>
+          <w:b/>
+        </w:rPr>
+        <w:t>Titolo del corso  : {{ event.name }}</w:t>
+      </w:r>
+      <w:proofErr w:type="gramStart"/>
+      <w:r>
+        <w:rPr>
+          <w:rFonts w:ascii="Calibri" w:hAnsi="Calibri" w:cs="Calibri"/>
+          <w:b/>
+        </w:rPr>
+      </w:r>
+      <w:r>
+        <w:rPr>
+          <w:rFonts w:ascii="Calibri" w:hAnsi="Calibri" w:cs="Calibri"/>
+          <w:b/>
+        </w:rPr>
+      </w:r>
+      <w:proofErr w:type="gramEnd"/>
+      <w:r>
+        <w:rPr>
+          <w:rFonts w:ascii="Calibri" w:hAnsi="Calibri" w:cs="Calibri"/>
+          <w:b/>
+        </w:rPr>
+      </w:r>
+      <w:r>
+        <w:rPr>
+          <w:rFonts w:ascii="Calibri" w:hAnsi="Calibri" w:cs="Calibri"/>
+          <w:b/>
+          <w:i/>
+          <w:iCs/>
+          <w:sz w:val="24"/>
+          <w:szCs w:val="24"/>
+        </w:rPr>
+      </w:r>
+    </w:p>
+    <w:p>
+      <w:pPr>
+        <w:adjustRightInd w:val="0"/>
+        <w:spacing w:before="40" w:after="40" w:line="240" w:lineRule="auto"/>
+        <w:jc w:val="both"/>
+        <w:rPr>
+          <w:rFonts w:ascii="Arial" w:hAnsi="Arial" w:cs="Arial"/>
+        </w:rPr>
+      </w:pPr>
+    </w:p>
+    <w:p>
+      <w:pPr>
+        <w:keepLines/>
+        <w:keepNext/>
+        <w:adjustRightInd w:val="0"/>
+        <w:spacing w:before="40" w:after="40" w:line="240" w:lineRule="auto"/>
+        <w:jc w:val="both"/>
+        <w:rPr>
+          <w:rFonts w:ascii="Arial" w:hAnsi="Arial" w:cs="Arial"/>
+        </w:rPr>
+      </w:pPr>
+      <w:r>
+        <w:rPr>
+          <w:rFonts w:ascii="Calibri" w:hAnsi="Calibri" w:cs="Calibri"/>
           <w:b/>
           <w:bCs/>
+        </w:rPr>
+        <w:t>Data {{ event.start_date|format_date }}</w:t>
+      </w:r>
+      <w:r>
+        <w:rPr>
+          <w:rFonts w:ascii="Calibri" w:hAnsi="Calibri" w:cs="Calibri"/>
+          <w:b/>
+          <w:bCs/>
+        </w:rPr>
+      </w:r>
+      <w:r>
+        <w:rPr>
+          <w:rFonts w:ascii="Calibri" w:hAnsi="Calibri" w:cs="Calibri"/>
+        </w:rPr>
+      </w:r>
+    </w:p>
+    <w:p>
+      <w:pPr>
+        <w:adjustRightInd w:val="0"/>
+        <w:spacing w:before="40" w:after="40" w:line="240" w:lineRule="auto"/>
+        <w:jc w:val="both"/>
+        <w:rPr>
+          <w:rFonts w:ascii="Arial" w:hAnsi="Arial" w:cs="Arial"/>
+        </w:rPr>
+      </w:pPr>
+    </w:p>
+    <w:p>
+      <w:pPr>
+        <w:keepLines/>
+        <w:keepNext/>
+        <w:adjustRightInd w:val="0"/>
+        <w:spacing w:before="40" w:after="40" w:line="240" w:lineRule="auto"/>
+        <w:jc w:val="both"/>
+        <w:rPr>
+          <w:rFonts w:ascii="Arial" w:hAnsi="Arial" w:cs="Arial"/>
+        </w:rPr>
+      </w:pPr>
+      <w:proofErr w:type="gramStart"/>
+      <w:r>
+        <w:rPr>
+          <w:rFonts w:ascii="Calibri" w:hAnsi="Calibri" w:cs="Calibri"/>
+          <w:b/>
+          <w:bCs/>
+        </w:rPr>
+        <w:t>Sede: {{ event.location }}</w:t>
+      </w:r>
+      <w:r>
+        <w:rPr>
+          <w:rFonts w:ascii="Calibri" w:hAnsi="Calibri" w:cs="Calibri"/>
+        </w:rPr>
+      </w:r>
+      <w:proofErr w:type="gramEnd"/>
+      <w:r>
+        <w:rPr>
+          <w:rFonts w:ascii="Calibri" w:hAnsi="Calibri" w:cs="Calibri"/>
+        </w:rPr>
+      </w:r>
+    </w:p>
+    <w:p>
+      <w:pPr>
+        <w:adjustRightInd w:val="0"/>
+        <w:spacing w:before="40" w:after="40" w:line="240" w:lineRule="auto"/>
+        <w:jc w:val="both"/>
+        <w:rPr>
+          <w:rFonts w:ascii="Arial" w:hAnsi="Arial" w:cs="Arial"/>
+        </w:rPr>
+      </w:pPr>
+    </w:p>
+    <w:p>
+      <w:pPr>
+        <w:adjustRightInd w:val="0"/>
+        <w:spacing w:before="40" w:after="40" w:line="240" w:lineRule="auto"/>
+        <w:jc w:val="both"/>
+        <w:rPr>
+          <w:rFonts w:ascii="Arial" w:hAnsi="Arial" w:cs="Arial"/>
+        </w:rPr>
+      </w:pPr>
+    </w:p>
+    <w:p>
+      <w:pPr>
+        <w:adjustRightInd w:val="0"/>
+        <w:spacing w:before="40" w:after="40" w:line="240" w:lineRule="auto"/>
+        <w:jc w:val="both"/>
+        <w:rPr>
+          <w:rFonts w:ascii="Arial" w:hAnsi="Arial" w:cs="Arial"/>
+        </w:rPr>
+      </w:pPr>
+      <w:r>
+        <w:rPr>
+          <w:rFonts w:ascii="Calibri" w:hAnsi="Calibri" w:cs="Calibri"/>
+        </w:rPr>
+        <w:t>Dati Azienda: {{ sponsor.legal_name }} - {{ sponsor.billing_full_address }} - P.IVA {{ sponsor.vat_number }} - C.F. {{ sponsor.tax_code }}</w:t>
+      </w:r>
+      <w:proofErr w:type="gramStart"/>
+      <w:r>
+        <w:rPr>
+          <w:rFonts w:ascii="Calibri" w:hAnsi="Calibri" w:cs="Calibri"/>
+        </w:rPr>
+      </w:r>
+      <w:proofErr w:type="gramEnd"/>
+    </w:p>
+    <w:p>
+      <w:pPr>
+        <w:adjustRightInd w:val="0"/>
+        <w:spacing w:before="40" w:after="40" w:line="240" w:lineRule="auto"/>
+        <w:jc w:val="both"/>
+        <w:rPr>
+          <w:rFonts w:ascii="Arial" w:hAnsi="Arial" w:cs="Arial"/>
+        </w:rPr>
+      </w:pPr>
+    </w:p>
+    <w:p>
+      <w:pPr>
+        <w:adjustRightInd w:val="0"/>
+        <w:spacing w:before="40" w:after="40" w:line="240" w:lineRule="auto"/>
+        <w:jc w:val="both"/>
+        <w:rPr>
+          <w:rFonts w:ascii="Arial" w:hAnsi="Arial" w:cs="Arial"/>
+        </w:rPr>
+      </w:pPr>
+      <w:r>
+        <w:rPr>
+          <w:rFonts w:ascii="Calibri" w:hAnsi="Calibri" w:cs="Calibri"/>
+        </w:rPr>
+      </w:r>
+    </w:p>
+    <w:p>
+      <w:pPr>
+        <w:adjustRightInd w:val="0"/>
+        <w:spacing w:before="40" w:after="40" w:line="240" w:lineRule="auto"/>
+        <w:jc w:val="both"/>
+        <w:rPr>
+          <w:rFonts w:ascii="Arial" w:hAnsi="Arial" w:cs="Arial"/>
+        </w:rPr>
+      </w:pPr>
+    </w:p>
+    <w:p>
+      <w:pPr>
+        <w:adjustRightInd w:val="0"/>
+        <w:spacing w:before="40" w:after="40" w:line="240" w:lineRule="auto"/>
+        <w:jc w:val="both"/>
+        <w:rPr>
+          <w:rFonts w:ascii="Arial" w:hAnsi="Arial" w:cs="Arial"/>
+        </w:rPr>
+      </w:pPr>
+    </w:p>
+    <w:p>
+      <w:pPr>
+        <w:adjustRightInd w:val="0"/>
+        <w:spacing w:before="40" w:after="40" w:line="240" w:lineRule="auto"/>
+        <w:jc w:val="both"/>
+        <w:rPr>
+          <w:rFonts w:ascii="Arial" w:hAnsi="Arial" w:cs="Arial"/>
+        </w:rPr>
+      </w:pPr>
+    </w:p>
+    <w:p>
+      <w:pPr>
+        <w:adjustRightInd w:val="0"/>
+        <w:spacing w:before="40" w:after="40" w:line="240" w:lineRule="auto"/>
+        <w:jc w:val="both"/>
+        <w:rPr>
+          <w:rFonts w:ascii="Arial" w:hAnsi="Arial" w:cs="Arial"/>
+        </w:rPr>
+      </w:pPr>
+    </w:p>
+    <w:p>
+      <w:pPr>
+        <w:adjustRightInd w:val="0"/>
+        <w:spacing w:before="40" w:after="40" w:line="240" w:lineRule="auto"/>
+        <w:jc w:val="both"/>
+        <w:rPr>
+          <w:rFonts w:ascii="Arial" w:hAnsi="Arial" w:cs="Arial"/>
+        </w:rPr>
+      </w:pPr>
+      <w:r>
+        <w:rPr>
+          <w:rFonts w:ascii="Calibri" w:hAnsi="Calibri" w:cs="Calibri"/>
+        </w:rPr>
+        <w:t>Dettaglio analitico delle spese:</w:t>
+      </w:r>
+      <w:proofErr w:type="gramStart"/>
+      <w:r>
+        <w:rPr>
+          <w:rFonts w:ascii="Calibri" w:hAnsi="Calibri" w:cs="Calibri"/>
+        </w:rPr>
+      </w:r>
+      <w:proofErr w:type="gramEnd"/>
+      <w:r>
+        <w:rPr>
+          <w:rFonts w:ascii="Calibri" w:hAnsi="Calibri" w:cs="Calibri"/>
+        </w:rPr>
+      </w:r>
+      <w:r>
+        <w:rPr>
+          <w:rFonts w:ascii="Calibri" w:hAnsi="Calibri" w:cs="Calibri"/>
+        </w:rPr>
+      </w:r>
+      <w:r>
+        <w:rPr>
+          <w:rFonts w:ascii="Calibri" w:hAnsi="Calibri" w:cs="Calibri"/>
+        </w:rPr>
+      </w:r>
+      <w:r>
+        <w:rPr>
+          <w:rFonts w:ascii="Calibri" w:hAnsi="Calibri" w:cs="Calibri"/>
+        </w:rPr>
+      </w:r>
+      <w:r>
+        <w:rPr>
+          <w:rFonts w:ascii="Calibri" w:hAnsi="Calibri" w:cs="Calibri"/>
+        </w:rPr>
+      </w:r>
+      <w:r>
+        <w:rPr>
+          <w:rFonts w:ascii="Calibri" w:hAnsi="Calibri" w:cs="Calibri"/>
+        </w:rPr>
+      </w:r>
+      <w:r>
+        <w:rPr>
+          <w:rFonts w:ascii="Calibri" w:hAnsi="Calibri" w:cs="Calibri"/>
+        </w:rPr>
+      </w:r>
+    </w:p>
+    <w:p>
+      <w:pPr>
+        <w:adjustRightInd w:val="0"/>
+        <w:spacing w:before="40" w:after="40" w:line="240" w:lineRule="auto"/>
+        <w:jc w:val="both"/>
+        <w:rPr>
+          <w:rFonts w:ascii="Arial" w:hAnsi="Arial" w:cs="Arial"/>
+        </w:rPr>
+      </w:pPr>
+    </w:p>
+    <w:p>
+      <w:pPr>
+        <w:adjustRightInd w:val="0"/>
+        <w:spacing w:before="40" w:after="40" w:line="240" w:lineRule="auto"/>
+        <w:jc w:val="both"/>
+        <w:rPr>
+          <w:rFonts w:ascii="Arial" w:hAnsi="Arial" w:cs="Arial"/>
+        </w:rPr>
+      </w:pPr>
+    </w:p>
+    <w:p>
+      <w:pPr>
+        <w:pStyle w:val="Paragrafoelenco"/>
+        <w:widowControl/>
+        <w:numPr>
+          <w:ilvl w:val="0"/>
+          <w:numId w:val="6"/>
+        </w:numPr>
+        <w:adjustRightInd w:val="0"/>
+        <w:spacing w:before="40" w:line="240" w:lineRule="auto" w:after="40"/>
+        <w:contextualSpacing/>
+        <w:rPr>
+          <w:rFonts w:ascii="Arial" w:hAnsi="Arial" w:cs="Arial"/>
+        </w:rPr>
+      </w:pPr>
+      <w:r>
+        <w:rPr>
+          <w:rFonts w:ascii="Calibri" w:hAnsi="Calibri" w:cs="Calibri"/>
+        </w:rPr>
+      </w:r>
+      <w:proofErr w:type="gramStart"/>
+      <w:r>
+        <w:rPr>
+          <w:rFonts w:ascii="Calibri" w:hAnsi="Calibri" w:cs="Calibri"/>
+        </w:rPr>
+      </w:r>
+      <w:proofErr w:type="gramEnd"/>
+      <w:r>
+        <w:rPr>
+          <w:rFonts w:ascii="Calibri" w:hAnsi="Calibri" w:cs="Calibri"/>
+        </w:rPr>
+      </w:r>
+      <w:r>
+        <w:rPr>
+          <w:rFonts w:ascii="Calibri" w:hAnsi="Calibri" w:cs="Calibri"/>
+          <w:sz w:val="20"/>
+          <w:szCs w:val="20"/>
+          <w:u w:val="single"/>
+        </w:rPr>
+      </w:r>
+      <w:r>
+        <w:rPr>
+          <w:rFonts w:ascii="Calibri" w:hAnsi="Calibri" w:cs="Calibri"/>
+          <w:u w:val="single"/>
+        </w:rPr>
+      </w:r>
+    </w:p>
+    <w:p>
+      <w:pPr>
+        <w:pStyle w:val="Paragrafoelenco"/>
+        <w:widowControl/>
+        <w:numPr>
+          <w:ilvl w:val="0"/>
+          <w:numId w:val="6"/>
+        </w:numPr>
+        <w:adjustRightInd w:val="0"/>
+        <w:spacing w:before="40" w:line="240" w:lineRule="auto" w:after="40"/>
+        <w:contextualSpacing/>
+        <w:rPr>
+          <w:rFonts w:ascii="Arial" w:hAnsi="Arial" w:cs="Arial"/>
+        </w:rPr>
+      </w:pPr>
+      <w:r>
+        <w:rPr>
+          <w:rFonts w:ascii="Calibri" w:hAnsi="Calibri" w:cs="Calibri"/>
+        </w:rPr>
+      </w:r>
+      <w:proofErr w:type="gramStart"/>
+      <w:r>
+        <w:rPr>
+          <w:rFonts w:ascii="Calibri" w:hAnsi="Calibri" w:cs="Calibri"/>
+        </w:rPr>
+      </w:r>
+      <w:proofErr w:type="gramEnd"/>
+      <w:r>
+        <w:rPr>
+          <w:rFonts w:ascii="Calibri" w:hAnsi="Calibri" w:cs="Calibri"/>
+        </w:rPr>
+      </w:r>
+      <w:r>
+        <w:rPr>
+          <w:rFonts w:ascii="Calibri" w:hAnsi="Calibri" w:cs="Calibri"/>
+        </w:rPr>
+      </w:r>
+      <w:r>
+        <w:rPr>
+          <w:rFonts w:ascii="Calibri" w:hAnsi="Calibri" w:cs="Calibri"/>
+        </w:rPr>
+      </w:r>
+      <w:r>
+        <w:rPr>
+          <w:rFonts w:ascii="Calibri" w:hAnsi="Calibri" w:cs="Calibri"/>
+        </w:rPr>
+      </w:r>
+      <w:r>
+        <w:rPr>
+          <w:rFonts w:ascii="Calibri" w:hAnsi="Calibri" w:cs="Calibri"/>
+          <w:sz w:val="20"/>
+          <w:szCs w:val="20"/>
+          <w:u w:val="single"/>
+        </w:rPr>
+      </w:r>
+      <w:r>
+        <w:rPr>
+          <w:rFonts w:ascii="Calibri" w:hAnsi="Calibri" w:cs="Calibri"/>
+          <w:u w:val="single"/>
+        </w:rPr>
+      </w:r>
+    </w:p>
+    <w:p>
+      <w:pPr>
+        <w:pStyle w:val="Paragrafoelenco"/>
+        <w:widowControl/>
+        <w:numPr>
+          <w:ilvl w:val="0"/>
+          <w:numId w:val="6"/>
+        </w:numPr>
+        <w:adjustRightInd w:val="0"/>
+        <w:spacing w:before="40" w:line="240" w:lineRule="auto" w:after="40"/>
+        <w:contextualSpacing/>
+        <w:rPr>
+          <w:rFonts w:ascii="Arial" w:hAnsi="Arial" w:cs="Arial"/>
+        </w:rPr>
+      </w:pPr>
+      <w:r>
+        <w:rPr>
+          <w:rFonts w:ascii="Calibri" w:hAnsi="Calibri" w:cs="Calibri"/>
+        </w:rPr>
+      </w:r>
+      <w:proofErr w:type="gramStart"/>
+      <w:r>
+        <w:rPr>
+          <w:rFonts w:ascii="Calibri" w:hAnsi="Calibri" w:cs="Calibri"/>
+        </w:rPr>
+      </w:r>
+      <w:proofErr w:type="gramEnd"/>
+      <w:r>
+        <w:rPr>
+          <w:rFonts w:ascii="Calibri" w:hAnsi="Calibri" w:cs="Calibri"/>
+        </w:rPr>
+      </w:r>
+      <w:r>
+        <w:rPr>
+          <w:rFonts w:ascii="Calibri" w:hAnsi="Calibri" w:cs="Calibri"/>
+        </w:rPr>
+      </w:r>
+      <w:r>
+        <w:rPr>
+          <w:rFonts w:ascii="Calibri" w:hAnsi="Calibri" w:cs="Calibri"/>
+        </w:rPr>
+      </w:r>
+      <w:r>
+        <w:rPr>
+          <w:rFonts w:ascii="Calibri" w:hAnsi="Calibri" w:cs="Calibri"/>
+        </w:rPr>
+      </w:r>
+      <w:r>
+        <w:rPr>
+          <w:rFonts w:ascii="Calibri" w:hAnsi="Calibri" w:cs="Calibri"/>
+        </w:rPr>
+      </w:r>
+      <w:r>
+        <w:rPr>
+          <w:rFonts w:ascii="Calibri" w:hAnsi="Calibri" w:cs="Calibri"/>
+        </w:rPr>
+      </w:r>
+      <w:r>
+        <w:rPr>
+          <w:rFonts w:ascii="Calibri" w:hAnsi="Calibri" w:cs="Calibri"/>
+        </w:rPr>
+      </w:r>
+      <w:r>
+        <w:rPr>
+          <w:rFonts w:ascii="Calibri" w:hAnsi="Calibri" w:cs="Calibri"/>
+          <w:sz w:val="20"/>
+          <w:szCs w:val="20"/>
+          <w:u w:val="single"/>
+        </w:rPr>
+      </w:r>
+      <w:r>
+        <w:rPr>
+          <w:rFonts w:ascii="Calibri" w:hAnsi="Calibri" w:cs="Calibri"/>
+          <w:u w:val="single"/>
+        </w:rPr>
+      </w:r>
+    </w:p>
+    <w:p>
+      <w:pPr>
+        <w:pStyle w:val="Paragrafoelenco"/>
+        <w:widowControl/>
+        <w:numPr>
+          <w:ilvl w:val="0"/>
+          <w:numId w:val="6"/>
+        </w:numPr>
+        <w:adjustRightInd w:val="0"/>
+        <w:spacing w:before="40" w:line="240" w:lineRule="auto" w:after="40"/>
+        <w:contextualSpacing/>
+        <w:rPr>
+          <w:rFonts w:ascii="Arial" w:hAnsi="Arial" w:cs="Arial"/>
+        </w:rPr>
+      </w:pPr>
+      <w:r>
+        <w:rPr>
+          <w:rFonts w:ascii="Calibri" w:hAnsi="Calibri" w:cs="Calibri"/>
+        </w:rPr>
+      </w:r>
+      <w:proofErr w:type="gramStart"/>
+      <w:r>
+        <w:rPr>
+          <w:rFonts w:ascii="Calibri" w:hAnsi="Calibri" w:cs="Calibri"/>
+        </w:rPr>
+      </w:r>
+      <w:proofErr w:type="gramEnd"/>
+      <w:r>
+        <w:rPr>
+          <w:rFonts w:ascii="Calibri" w:hAnsi="Calibri" w:cs="Calibri"/>
+        </w:rPr>
+      </w:r>
+      <w:r>
+        <w:rPr>
+          <w:rFonts w:ascii="Calibri" w:hAnsi="Calibri" w:cs="Calibri"/>
+        </w:rPr>
+      </w:r>
+      <w:r>
+        <w:rPr>
+          <w:rFonts w:ascii="Calibri" w:hAnsi="Calibri" w:cs="Calibri"/>
+        </w:rPr>
+      </w:r>
+      <w:r>
+        <w:rPr>
+          <w:rFonts w:ascii="Calibri" w:hAnsi="Calibri" w:cs="Calibri"/>
+        </w:rPr>
+      </w:r>
+      <w:r>
+        <w:rPr>
+          <w:rFonts w:ascii="Calibri" w:hAnsi="Calibri" w:cs="Calibri"/>
+        </w:rPr>
+      </w:r>
+      <w:r>
+        <w:rPr>
+          <w:rFonts w:ascii="Calibri" w:hAnsi="Calibri" w:cs="Calibri"/>
+        </w:rPr>
+      </w:r>
+      <w:r>
+        <w:rPr>
+          <w:rFonts w:ascii="Calibri" w:hAnsi="Calibri" w:cs="Calibri"/>
+          <w:u w:val="single"/>
+        </w:rPr>
+      </w:r>
+      <w:r>
+        <w:rPr>
+          <w:rFonts w:ascii="Calibri" w:hAnsi="Calibri" w:cs="Calibri"/>
+          <w:u w:val="single"/>
+        </w:rPr>
+      </w:r>
+      <w:r>
+        <w:rPr>
+          <w:rFonts w:ascii="Calibri" w:hAnsi="Calibri" w:cs="Calibri"/>
+          <w:u w:val="single"/>
+        </w:rPr>
+      </w:r>
+      <w:r>
+        <w:rPr>
+          <w:rFonts w:ascii="Calibri" w:hAnsi="Calibri" w:cs="Calibri"/>
+          <w:u w:val="single"/>
+        </w:rPr>
+      </w:r>
+    </w:p>
+    <w:p>
+      <w:pPr>
+        <w:pStyle w:val="Paragrafoelenco"/>
+        <w:widowControl/>
+        <w:numPr>
+          <w:ilvl w:val="0"/>
+          <w:numId w:val="6"/>
+        </w:numPr>
+        <w:adjustRightInd w:val="0"/>
+        <w:spacing w:before="40" w:line="240" w:lineRule="auto" w:after="40"/>
+        <w:contextualSpacing/>
+        <w:rPr>
+          <w:rFonts w:ascii="Arial" w:hAnsi="Arial" w:cs="Arial"/>
+        </w:rPr>
+      </w:pPr>
+      <w:r>
+        <w:rPr>
+          <w:rFonts w:ascii="Calibri" w:hAnsi="Calibri" w:cs="Calibri"/>
+        </w:rPr>
+      </w:r>
+      <w:proofErr w:type="gramStart"/>
+      <w:r>
+        <w:rPr>
+          <w:rFonts w:ascii="Calibri" w:hAnsi="Calibri" w:cs="Calibri"/>
+        </w:rPr>
+      </w:r>
+      <w:proofErr w:type="gramEnd"/>
+      <w:r>
+        <w:rPr>
+          <w:rFonts w:ascii="Calibri" w:hAnsi="Calibri" w:cs="Calibri"/>
+        </w:rPr>
+      </w:r>
+      <w:r>
+        <w:rPr>
+          <w:rFonts w:ascii="Calibri" w:hAnsi="Calibri" w:cs="Calibri"/>
+        </w:rPr>
+      </w:r>
+      <w:r>
+        <w:rPr>
+          <w:rFonts w:ascii="Calibri" w:hAnsi="Calibri" w:cs="Calibri"/>
+        </w:rPr>
+      </w:r>
+      <w:r>
+        <w:rPr>
+          <w:rFonts w:ascii="Calibri" w:hAnsi="Calibri" w:cs="Calibri"/>
+        </w:rPr>
+      </w:r>
+      <w:r>
+        <w:rPr>
+          <w:rFonts w:ascii="Calibri" w:hAnsi="Calibri" w:cs="Calibri"/>
+          <w:sz w:val="20"/>
+          <w:szCs w:val="20"/>
+          <w:u w:val="single"/>
+        </w:rPr>
+      </w:r>
+      <w:r>
+        <w:rPr>
+          <w:rFonts w:ascii="Calibri" w:hAnsi="Calibri" w:cs="Calibri"/>
+          <w:u w:val="single"/>
+        </w:rPr>
+      </w:r>
+    </w:p>
+    <w:p>
+      <w:pPr>
+        <w:pStyle w:val="Paragrafoelenco"/>
+        <w:widowControl/>
+        <w:numPr>
+          <w:ilvl w:val="0"/>
+          <w:numId w:val="6"/>
+        </w:numPr>
+        <w:adjustRightInd w:val="0"/>
+        <w:spacing w:before="40" w:line="240" w:lineRule="auto" w:after="40"/>
+        <w:contextualSpacing/>
+        <w:rPr>
+          <w:rFonts w:ascii="Arial" w:hAnsi="Arial" w:cs="Arial"/>
+        </w:rPr>
+      </w:pPr>
+      <w:r>
+        <w:rPr>
+          <w:rFonts w:ascii="Calibri" w:hAnsi="Calibri" w:cs="Calibri"/>
+        </w:rPr>
+      </w:r>
+      <w:proofErr w:type="gramStart"/>
+      <w:r>
+        <w:rPr>
+          <w:rFonts w:ascii="Calibri" w:hAnsi="Calibri" w:cs="Calibri"/>
+        </w:rPr>
+      </w:r>
+      <w:proofErr w:type="gramEnd"/>
+      <w:r>
+        <w:rPr>
+          <w:rFonts w:ascii="Calibri" w:hAnsi="Calibri" w:cs="Calibri"/>
+          <w:u w:val="single"/>
+        </w:rPr>
+      </w:r>
+      <w:r>
+        <w:rPr>
+          <w:rFonts w:ascii="Calibri" w:hAnsi="Calibri" w:cs="Calibri"/>
+          <w:u w:val="single"/>
+        </w:rPr>
+      </w:r>
+      <w:r>
+        <w:rPr>
+          <w:rFonts w:ascii="Calibri" w:hAnsi="Calibri" w:cs="Calibri"/>
+          <w:u w:val="single"/>
+        </w:rPr>
+      </w:r>
+      <w:r>
+        <w:rPr>
+          <w:rFonts w:ascii="Calibri" w:hAnsi="Calibri" w:cs="Calibri"/>
+          <w:u w:val="single"/>
+        </w:rPr>
+      </w:r>
+      <w:r>
+        <w:rPr>
+          <w:rFonts w:ascii="Calibri" w:hAnsi="Calibri" w:cs="Calibri"/>
+        </w:rPr>
+      </w:r>
+      <w:r>
+        <w:rPr>
+          <w:rFonts w:ascii="Calibri" w:hAnsi="Calibri" w:cs="Calibri"/>
+        </w:rPr>
+      </w:r>
+      <w:r>
+        <w:rPr>
+          <w:rFonts w:ascii="Calibri" w:hAnsi="Calibri" w:cs="Calibri"/>
+        </w:rPr>
+      </w:r>
+      <w:r>
+        <w:rPr>
+          <w:rFonts w:ascii="Calibri" w:hAnsi="Calibri" w:cs="Calibri"/>
+          <w:sz w:val="20"/>
+          <w:szCs w:val="20"/>
+          <w:u w:val="single"/>
+        </w:rPr>
+      </w:r>
+      <w:r>
+        <w:rPr>
+          <w:rFonts w:ascii="Calibri" w:hAnsi="Calibri" w:cs="Calibri"/>
+          <w:u w:val="single"/>
+        </w:rPr>
+      </w:r>
+    </w:p>
+    <w:p>
+      <w:pPr>
+        <w:pStyle w:val="Paragrafoelenco"/>
+        <w:widowControl/>
+        <w:numPr>
+          <w:ilvl w:val="0"/>
+          <w:numId w:val="6"/>
+        </w:numPr>
+        <w:adjustRightInd w:val="0"/>
+        <w:spacing w:before="40" w:line="240" w:lineRule="auto" w:after="40"/>
+        <w:contextualSpacing/>
+        <w:rPr>
+          <w:rFonts w:ascii="Arial" w:hAnsi="Arial" w:cs="Arial"/>
+        </w:rPr>
+      </w:pPr>
+      <w:r>
+        <w:rPr>
+          <w:rFonts w:ascii="Calibri" w:hAnsi="Calibri" w:cs="Calibri"/>
+        </w:rPr>
+      </w:r>
+      <w:proofErr w:type="gramStart"/>
+      <w:r>
+        <w:rPr>
+          <w:rFonts w:ascii="Calibri" w:hAnsi="Calibri" w:cs="Calibri"/>
+        </w:rPr>
+      </w:r>
+      <w:proofErr w:type="gramEnd"/>
+      <w:r>
+        <w:rPr>
+          <w:rFonts w:ascii="Calibri" w:hAnsi="Calibri" w:cs="Calibri"/>
+        </w:rPr>
+      </w:r>
+      <w:r>
+        <w:rPr>
+          <w:rFonts w:ascii="Calibri" w:hAnsi="Calibri" w:cs="Calibri"/>
+        </w:rPr>
+      </w:r>
+      <w:r>
+        <w:rPr>
+          <w:rFonts w:ascii="Calibri" w:hAnsi="Calibri" w:cs="Calibri"/>
+        </w:rPr>
+      </w:r>
+      <w:r>
+        <w:rPr>
+          <w:rFonts w:ascii="Calibri" w:hAnsi="Calibri" w:cs="Calibri"/>
+        </w:rPr>
+      </w:r>
+      <w:r>
+        <w:rPr>
+          <w:rFonts w:ascii="Calibri" w:hAnsi="Calibri" w:cs="Calibri"/>
+        </w:rPr>
+      </w:r>
+      <w:r>
+        <w:rPr>
+          <w:rFonts w:ascii="Calibri" w:hAnsi="Calibri" w:cs="Calibri"/>
+          <w:sz w:val="20"/>
+          <w:szCs w:val="20"/>
+          <w:u w:val="single"/>
+        </w:rPr>
+      </w:r>
+      <w:r>
+        <w:rPr>
+          <w:rFonts w:ascii="Calibri" w:hAnsi="Calibri" w:cs="Calibri"/>
+          <w:u w:val="single"/>
+        </w:rPr>
+      </w:r>
+    </w:p>
+    <w:p>
+      <w:pPr>
+        <w:pStyle w:val="Paragrafoelenco"/>
+        <w:widowControl/>
+        <w:numPr>
+          <w:ilvl w:val="0"/>
+          <w:numId w:val="6"/>
+        </w:numPr>
+        <w:adjustRightInd w:val="0"/>
+        <w:spacing w:before="40" w:line="240" w:lineRule="auto" w:after="40"/>
+        <w:contextualSpacing/>
+        <w:rPr>
+          <w:rFonts w:ascii="Arial" w:hAnsi="Arial" w:cs="Arial"/>
+        </w:rPr>
+      </w:pPr>
+      <w:r>
+        <w:rPr>
+          <w:rFonts w:ascii="Calibri" w:hAnsi="Calibri" w:cs="Calibri"/>
+        </w:rPr>
+      </w:r>
+      <w:proofErr w:type="gramStart"/>
+      <w:r>
+        <w:rPr>
+          <w:rFonts w:ascii="Calibri" w:hAnsi="Calibri" w:cs="Calibri"/>
+        </w:rPr>
+      </w:r>
+      <w:proofErr w:type="gramEnd"/>
+      <w:r>
+        <w:rPr>
+          <w:rFonts w:ascii="Calibri" w:hAnsi="Calibri" w:cs="Calibri"/>
+        </w:rPr>
+      </w:r>
+      <w:r>
+        <w:rPr>
+          <w:rFonts w:ascii="Calibri" w:hAnsi="Calibri" w:cs="Calibri"/>
+        </w:rPr>
+      </w:r>
+      <w:r>
+        <w:rPr>
+          <w:rFonts w:ascii="Calibri" w:hAnsi="Calibri" w:cs="Calibri"/>
+        </w:rPr>
+      </w:r>
+      <w:r>
+        <w:rPr>
+          <w:rFonts w:ascii="Calibri" w:hAnsi="Calibri" w:cs="Calibri"/>
+        </w:rPr>
+      </w:r>
+      <w:r>
+        <w:rPr>
+          <w:rFonts w:ascii="Calibri" w:hAnsi="Calibri" w:cs="Calibri"/>
+        </w:rPr>
+      </w:r>
+      <w:r>
+        <w:rPr>
+          <w:rFonts w:ascii="Calibri" w:hAnsi="Calibri" w:cs="Calibri"/>
+        </w:rPr>
+      </w:r>
+      <w:r>
+        <w:rPr>
+          <w:rFonts w:ascii="Calibri" w:hAnsi="Calibri" w:cs="Calibri"/>
+          <w:sz w:val="20"/>
+          <w:szCs w:val="20"/>
+          <w:u w:val="single"/>
+        </w:rPr>
+      </w:r>
+      <w:r>
+        <w:rPr>
+          <w:rFonts w:ascii="Calibri" w:hAnsi="Calibri" w:cs="Calibri"/>
+          <w:u w:val="single"/>
+        </w:rPr>
+      </w:r>
+    </w:p>
+    <w:p>
+      <w:pPr>
+        <w:adjustRightInd w:val="0"/>
+        <w:spacing w:line="240" w:lineRule="auto" w:before="40" w:after="40"/>
+        <w:jc w:val="both"/>
+        <w:rPr>
+          <w:rFonts w:ascii="Arial" w:hAnsi="Arial" w:cs="Arial"/>
+        </w:rPr>
+      </w:pPr>
+    </w:p>
+    <w:p>
+      <w:pPr>
+        <w:adjustRightInd w:val="0"/>
+        <w:spacing w:line="240" w:lineRule="auto" w:before="40" w:after="40"/>
+        <w:jc w:val="both"/>
+        <w:rPr>
+          <w:rFonts w:ascii="Arial" w:hAnsi="Arial" w:cs="Arial"/>
+        </w:rPr>
+      </w:pPr>
+      <w:proofErr w:type="gramStart"/>
+      <w:proofErr w:type="gramEnd"/>
+      <w:r>
+        <w:rPr>
+          <w:rFonts w:ascii="Calibri" w:hAnsi="Calibri" w:cs="Calibri"/>
+        </w:rPr>
+        <w:t xml:space="preserve">{%p for category_label, items in lines_by_category %}</w:t>
+      </w:r>
+    </w:p>
+    <w:p>
+      <w:pPr>
+        <w:adjustRightInd w:val="0"/>
+        <w:spacing w:line="240" w:lineRule="auto" w:before="40" w:after="40"/>
+        <w:jc w:val="both"/>
+        <w:rPr>
+          <w:rFonts w:ascii="Arial" w:hAnsi="Arial" w:cs="Arial"/>
+        </w:rPr>
+      </w:pPr>
+      <w:proofErr w:type="gramStart"/>
+      <w:proofErr w:type="gramEnd"/>
+      <w:r>
+        <w:rPr>
+          <w:rFonts w:ascii="Calibri" w:hAnsi="Calibri" w:cs="Calibri"/>
+        </w:rPr>
+        <w:t xml:space="preserve">{{ category_label }}</w:t>
+      </w:r>
+    </w:p>
+    <w:p>
+      <w:pPr>
+        <w:adjustRightInd w:val="0"/>
+        <w:spacing w:line="240" w:lineRule="auto" w:before="40" w:after="40"/>
+        <w:jc w:val="both"/>
+        <w:rPr>
+          <w:rFonts w:ascii="Arial" w:hAnsi="Arial" w:cs="Arial"/>
+        </w:rPr>
+      </w:pPr>
+      <w:proofErr w:type="gramStart"/>
+      <w:proofErr w:type="gramEnd"/>
+      <w:r>
+        <w:rPr>
+          <w:rFonts w:ascii="Calibri" w:hAnsi="Calibri" w:cs="Calibri"/>
+        </w:rPr>
+        <w:t xml:space="preserve">{%p for line in items %}</w:t>
+      </w:r>
+    </w:p>
+    <w:p>
+      <w:pPr>
+        <w:adjustRightInd w:val="0"/>
+        <w:spacing w:line="240" w:lineRule="auto" w:before="40" w:after="40"/>
+        <w:jc w:val="both"/>
+        <w:rPr>
+          <w:rFonts w:ascii="Arial" w:hAnsi="Arial" w:cs="Arial"/>
+        </w:rPr>
+      </w:pPr>
+      <w:proofErr w:type="gramStart"/>
+      <w:proofErr w:type="gramEnd"/>
+      <w:r>
+        <w:rPr>
+          <w:rFonts w:ascii="Calibri" w:hAnsi="Calibri" w:cs="Calibri"/>
+        </w:rPr>
+        <w:t xml:space="preserve"> - {{ line.service_name_snapshot }}: € {{ line.line_subtotal|format_currency }} + IVA</w:t>
+      </w:r>
+    </w:p>
+    <w:p>
+      <w:pPr>
+        <w:adjustRightInd w:val="0"/>
+        <w:spacing w:line="240" w:lineRule="auto" w:before="40" w:after="40"/>
+        <w:jc w:val="both"/>
+        <w:rPr>
+          <w:rFonts w:ascii="Arial" w:hAnsi="Arial" w:cs="Arial"/>
+        </w:rPr>
+      </w:pPr>
+      <w:proofErr w:type="gramStart"/>
+      <w:proofErr w:type="gramEnd"/>
+      <w:r>
+        <w:rPr>
+          <w:rFonts w:ascii="Calibri" w:hAnsi="Calibri" w:cs="Calibri"/>
+        </w:rPr>
+        <w:t xml:space="preserve">{%p endfor %}</w:t>
+      </w:r>
+    </w:p>
+    <w:p>
+      <w:pPr>
+        <w:adjustRightInd w:val="0"/>
+        <w:spacing w:line="240" w:lineRule="auto" w:before="40" w:after="40"/>
+        <w:jc w:val="both"/>
+        <w:rPr>
+          <w:rFonts w:ascii="Arial" w:hAnsi="Arial" w:cs="Arial"/>
+        </w:rPr>
+      </w:pPr>
+      <w:proofErr w:type="gramStart"/>
+      <w:proofErr w:type="gramEnd"/>
+      <w:r>
+        <w:rPr>
+          <w:rFonts w:ascii="Calibri" w:hAnsi="Calibri" w:cs="Calibri"/>
+        </w:rPr>
+        <w:t xml:space="preserve">{%p endfor %}</w:t>
+      </w:r>
+    </w:p>
+    <w:p>
+      <w:pPr>
+        <w:adjustRightInd w:val="0"/>
+        <w:spacing w:line="240" w:lineRule="auto" w:before="40" w:after="40"/>
+        <w:jc w:val="both"/>
+        <w:rPr>
+          <w:rFonts w:ascii="Arial" w:hAnsi="Arial" w:cs="Arial"/>
+        </w:rPr>
+      </w:pPr>
+      <w:proofErr w:type="gramStart"/>
+      <w:proofErr w:type="gramEnd"/>
+      <w:r>
+        <w:rPr>
+          <w:rFonts w:ascii="Calibri" w:hAnsi="Calibri" w:cs="Calibri"/>
+        </w:rPr>
+      </w:r>
+    </w:p>
+    <w:p>
+      <w:pPr>
+        <w:adjustRightInd w:val="0"/>
+        <w:spacing w:line="240" w:lineRule="auto" w:before="40" w:after="40"/>
+        <w:jc w:val="both"/>
+        <w:rPr>
+          <w:rFonts w:ascii="Arial" w:hAnsi="Arial" w:cs="Arial"/>
+        </w:rPr>
+      </w:pPr>
+      <w:proofErr w:type="gramStart"/>
+      <w:proofErr w:type="gramEnd"/>
+      <w:r>
+        <w:rPr>
+          <w:rFonts w:ascii="Calibri" w:hAnsi="Calibri" w:cs="Calibri"/>
+        </w:rPr>
+        <w:t xml:space="preserve">Subtotale: € {{ contract.subtotal|format_currency }}</w:t>
+      </w:r>
+    </w:p>
+    <w:p>
+      <w:pPr>
+        <w:adjustRightInd w:val="0"/>
+        <w:spacing w:line="240" w:lineRule="auto" w:before="40" w:after="40"/>
+        <w:jc w:val="both"/>
+        <w:rPr>
+          <w:rFonts w:ascii="Arial" w:hAnsi="Arial" w:cs="Arial"/>
+        </w:rPr>
+      </w:pPr>
+      <w:proofErr w:type="gramStart"/>
+      <w:proofErr w:type="gramEnd"/>
+      <w:r>
+        <w:rPr>
+          <w:rFonts w:ascii="Calibri" w:hAnsi="Calibri" w:cs="Calibri"/>
+        </w:rPr>
+        <w:t xml:space="preserve">IVA ({{ contract.vat_rate }}%): € {{ contract.vat_amount|format_currency }}</w:t>
+      </w:r>
+    </w:p>
+    <w:p>
+      <w:pPr>
+        <w:adjustRightInd w:val="0"/>
+        <w:spacing w:line="240" w:lineRule="auto" w:before="40" w:after="40"/>
+        <w:jc w:val="both"/>
+        <w:rPr>
+          <w:rFonts w:ascii="Arial" w:hAnsi="Arial" w:cs="Arial"/>
+        </w:rPr>
+      </w:pPr>
+      <w:proofErr w:type="gramStart"/>
+      <w:proofErr w:type="gramEnd"/>
+      <w:r>
+        <w:rPr>
+          <w:rFonts w:ascii="Calibri" w:hAnsi="Calibri" w:cs="Calibri"/>
+        </w:rPr>
+        <w:t xml:space="preserve">TOTALE: € {{ contract.total|format_currency }}</w:t>
+      </w:r>
+    </w:p>
+    <w:p>
+      <w:pPr>
+        <w:adjustRightInd w:val="0"/>
+        <w:spacing w:line="240" w:lineRule="auto" w:before="40" w:after="40"/>
+        <w:jc w:val="both"/>
+        <w:rPr>
+          <w:rFonts w:ascii="Arial" w:hAnsi="Arial" w:cs="Arial"/>
+        </w:rPr>
+      </w:pPr>
+      <w:proofErr w:type="gramStart"/>
+      <w:proofErr w:type="gramEnd"/>
+      <w:r>
+        <w:rPr>
+          <w:rFonts w:ascii="Calibri" w:hAnsi="Calibri" w:cs="Calibri"/>
+        </w:rPr>
+      </w:r>
+    </w:p>
+    <w:p>
+      <w:pPr>
+        <w:adjustRightInd w:val="0"/>
+        <w:spacing w:line="240" w:lineRule="auto" w:before="40" w:after="40"/>
+        <w:jc w:val="both"/>
+        <w:rPr>
+          <w:rFonts w:ascii="Arial" w:hAnsi="Arial" w:cs="Arial"/>
+        </w:rPr>
+      </w:pPr>
+      <w:r>
+        <w:rPr>
+          <w:rFonts w:ascii="Calibri" w:hAnsi="Calibri" w:cs="Calibri"/>
+        </w:rPr>
+        <w:t xml:space="preserve">Modalità di </w:t>
+      </w:r>
+      <w:proofErr w:type="gramStart"/>
+      <w:r>
+        <w:rPr>
+          <w:rFonts w:ascii="Calibri" w:hAnsi="Calibri" w:cs="Calibri"/>
+        </w:rPr>
+        <w:t>Pagamento :</w:t>
+      </w:r>
+      <w:proofErr w:type="gramEnd"/>
+      <w:r>
+        <w:rPr>
+          <w:rFonts w:ascii="Calibri" w:hAnsi="Calibri" w:cs="Calibri"/>
+        </w:rPr>
+        <w:t xml:space="preserve"> </w:t>
+      </w:r>
+      <w:r>
+        <w:rPr>
+          <w:rFonts w:ascii="Calibri" w:hAnsi="Calibri" w:cs="Calibri"/>
+          <w:i/>
+        </w:rPr>
+        <w:t>Bonifico Bancario Anticipato</w:t>
+      </w:r>
+    </w:p>
+    <w:p>
+      <w:pPr>
+        <w:adjustRightInd w:val="0"/>
+        <w:spacing w:before="40" w:after="40" w:line="240" w:lineRule="auto"/>
+        <w:jc w:val="both"/>
+        <w:rPr>
+          <w:rFonts w:ascii="Arial" w:eastAsia="Calibri" w:hAnsi="Arial" w:cs="Arial"/>
+          <w:lang w:eastAsia="en-US" w:bidi="ar-SA"/>
+        </w:rPr>
+      </w:pPr>
+      <w:proofErr w:type="gramStart"/>
+      <w:r>
+        <w:rPr>
+          <w:rFonts w:ascii="Calibri" w:eastAsia="Calibri" w:hAnsi="Calibri" w:cs="Calibri"/>
+          <w:lang w:eastAsia="en-US" w:bidi="ar-SA"/>
+        </w:rPr>
+        <w:t>Beneficiario :</w:t>
+      </w:r>
+      <w:proofErr w:type="gramEnd"/>
+      <w:r>
+        <w:rPr>
+          <w:rFonts w:ascii="Calibri" w:eastAsia="Calibri" w:hAnsi="Calibri" w:cs="Calibri"/>
+          <w:lang w:eastAsia="en-US" w:bidi="ar-SA"/>
+        </w:rPr>
+        <w:t xml:space="preserve"> VALET SRL - </w:t>
+      </w:r>
+    </w:p>
+    <w:p>
+      <w:pPr>
+        <w:adjustRightInd w:val="0"/>
+        <w:spacing w:before="40" w:after="40" w:line="240" w:lineRule="auto"/>
+        <w:jc w:val="both"/>
+        <w:rPr>
+          <w:rFonts w:ascii="Arial" w:eastAsia="Calibri" w:hAnsi="Arial" w:cs="Arial"/>
+          <w:lang w:eastAsia="en-US" w:bidi="ar-SA"/>
+        </w:rPr>
+      </w:pPr>
+      <w:proofErr w:type="gramStart"/>
+      <w:r>
+        <w:rPr>
+          <w:rFonts w:ascii="Calibri" w:eastAsia="Calibri" w:hAnsi="Calibri" w:cs="Calibri"/>
+          <w:lang w:eastAsia="en-US" w:bidi="ar-SA"/>
+        </w:rPr>
+        <w:t>Banca :</w:t>
+      </w:r>
+      <w:proofErr w:type="gramEnd"/>
+      <w:r>
+        <w:rPr>
+          <w:rFonts w:ascii="Calibri" w:eastAsia="Calibri" w:hAnsi="Calibri" w:cs="Calibri"/>
+          <w:lang w:eastAsia="en-US" w:bidi="ar-SA"/>
+        </w:rPr>
+        <w:t xml:space="preserve"> INTESA SAN PAOLO - Agenzia di Via Marconi 51  Bologna </w:t>
+      </w:r>
+    </w:p>
+    <w:p>
+      <w:pPr>
+        <w:adjustRightInd w:val="0"/>
+        <w:spacing w:before="40" w:after="40" w:line="240" w:lineRule="auto"/>
+        <w:jc w:val="both"/>
+        <w:rPr>
+          <w:rFonts w:ascii="Arial" w:eastAsia="Calibri" w:hAnsi="Arial" w:cs="Arial"/>
+          <w:lang w:eastAsia="en-US" w:bidi="ar-SA"/>
+        </w:rPr>
+      </w:pPr>
+      <w:proofErr w:type="gramStart"/>
+      <w:r>
+        <w:rPr>
+          <w:rFonts w:ascii="Calibri" w:eastAsia="Calibri" w:hAnsi="Calibri" w:cs="Calibri"/>
+          <w:lang w:eastAsia="en-US" w:bidi="ar-SA"/>
+        </w:rPr>
+        <w:t>IBAN :</w:t>
+      </w:r>
+      <w:proofErr w:type="gramEnd"/>
+      <w:r>
+        <w:rPr>
+          <w:rFonts w:ascii="Calibri" w:eastAsia="Calibri" w:hAnsi="Calibri" w:cs="Calibri"/>
+          <w:lang w:eastAsia="en-US" w:bidi="ar-SA"/>
+        </w:rPr>
+        <w:t xml:space="preserve"> IT37 A030 6902 5201 0000 0011 856 BIC: BCITITMM </w:t>
+      </w:r>
+    </w:p>
+    <w:p>
+      <w:pPr>
+        <w:adjustRightInd w:val="0"/>
+        <w:spacing w:line="240" w:lineRule="auto" w:before="40" w:after="40"/>
+        <w:jc w:val="both"/>
+        <w:rPr>
+          <w:rFonts w:ascii="Arial" w:hAnsi="Arial" w:cs="Arial"/>
+        </w:rPr>
+      </w:pPr>
+    </w:p>
+    <w:p>
+      <w:pPr>
+        <w:adjustRightInd w:val="0"/>
+        <w:spacing w:line="240" w:lineRule="auto" w:before="40" w:after="40"/>
+        <w:jc w:val="both"/>
+        <w:rPr>
+          <w:rFonts w:ascii="Arial" w:hAnsi="Arial" w:cs="Arial"/>
+        </w:rPr>
+      </w:pPr>
+      <w:r>
+        <w:rPr>
+          <w:rFonts w:ascii="Calibri" w:hAnsi="Calibri" w:cs="Calibri"/>
+        </w:rPr>
+        <w:tab/>
+      </w:r>
+      <w:r>
+        <w:rPr>
+          <w:rFonts w:ascii="Calibri" w:hAnsi="Calibri" w:cs="Calibri"/>
+        </w:rPr>
+        <w:tab/>
+      </w:r>
+      <w:r>
+        <w:rPr>
+          <w:rFonts w:ascii="Calibri" w:hAnsi="Calibri" w:cs="Calibri"/>
+        </w:rPr>
+        <w:tab/>
+      </w:r>
+      <w:r>
+        <w:rPr>
+          <w:rFonts w:ascii="Calibri" w:hAnsi="Calibri" w:cs="Calibri"/>
+        </w:rPr>
+        <w:tab/>
+      </w:r>
+      <w:r>
+        <w:rPr>
+          <w:rFonts w:ascii="Calibri" w:hAnsi="Calibri" w:cs="Calibri"/>
+        </w:rPr>
+        <w:tab/>
+      </w:r>
+      <w:r>
+        <w:rPr>
+          <w:rFonts w:ascii="Calibri" w:hAnsi="Calibri" w:cs="Calibri"/>
+        </w:rPr>
+        <w:tab/>
+      </w:r>
+      <w:r>
+        <w:rPr>
+          <w:rFonts w:ascii="Calibri" w:hAnsi="Calibri" w:cs="Calibri"/>
+        </w:rPr>
+        <w:tab/>
+      </w:r>
+      <w:r>
+        <w:rPr>
+          <w:rFonts w:ascii="Calibri" w:hAnsi="Calibri" w:cs="Calibri"/>
+        </w:rPr>
+        <w:tab/>
+      </w:r>
+      <w:r>
+        <w:rPr>
+          <w:rFonts w:ascii="Calibri" w:hAnsi="Calibri" w:cs="Calibri"/>
+        </w:rPr>
+        <w:tab/>
+      </w:r>
+      <w:r>
+        <w:rPr>
+          <w:rFonts w:ascii="Calibri" w:hAnsi="Calibri" w:cs="Calibri"/>
+        </w:rPr>
+        <w:t>Aziend</w:t>
+      </w:r>
+      <w:r>
+        <w:rPr>
+          <w:rFonts w:ascii="Calibri" w:hAnsi="Calibri" w:cs="Calibri"/>
+        </w:rPr>
+        <w:t>a</w:t>
+      </w:r>
+    </w:p>
+    <w:p>
+      <w:pPr>
+        <w:adjustRightInd w:val="0"/>
+        <w:spacing w:line="240" w:lineRule="auto" w:before="40" w:after="40"/>
+        <w:jc w:val="both"/>
+        <w:rPr>
+          <w:rFonts w:ascii="Arial" w:hAnsi="Arial" w:cs="Arial"/>
+        </w:rPr>
+      </w:pPr>
+      <w:r>
+        <w:rPr>
+          <w:rFonts w:ascii="Calibri" w:hAnsi="Calibri" w:cs="Calibri"/>
+        </w:rPr>
+        <w:t>Data</w:t>
+      </w:r>
+      <w:r>
+        <w:rPr>
+          <w:rFonts w:ascii="Calibri" w:hAnsi="Calibri" w:cs="Calibri"/>
+          <w:u w:val="single"/>
+        </w:rPr>
+        <w:tab/>
+      </w:r>
+      <w:r>
+        <w:rPr>
+          <w:rFonts w:ascii="Calibri" w:hAnsi="Calibri" w:cs="Calibri"/>
+          <w:u w:val="single"/>
+        </w:rPr>
+        <w:tab/>
+      </w:r>
+      <w:r>
+        <w:rPr>
+          <w:rFonts w:ascii="Calibri" w:hAnsi="Calibri" w:cs="Calibri"/>
+          <w:u w:val="single"/>
+        </w:rPr>
+        <w:tab/>
+      </w:r>
+      <w:r>
+        <w:rPr>
+          <w:rFonts w:ascii="Calibri" w:hAnsi="Calibri" w:cs="Calibri"/>
+          <w:u w:val="single"/>
+        </w:rPr>
+        <w:tab/>
+      </w:r>
+      <w:r>
+        <w:rPr>
+          <w:rFonts w:ascii="Calibri" w:hAnsi="Calibri" w:cs="Calibri"/>
+        </w:rPr>
+        <w:tab/>
+      </w:r>
+      <w:r>
+        <w:rPr>
+          <w:rFonts w:ascii="Calibri" w:hAnsi="Calibri" w:cs="Calibri"/>
+        </w:rPr>
+        <w:tab/>
+      </w:r>
+      <w:r>
+        <w:rPr>
+          <w:rFonts w:ascii="Calibri" w:hAnsi="Calibri" w:cs="Calibri"/>
+        </w:rPr>
+        <w:tab/>
+      </w:r>
+      <w:r>
+        <w:rPr>
+          <w:rFonts w:ascii="Calibri" w:hAnsi="Calibri" w:cs="Calibri"/>
+        </w:rPr>
+        <w:tab/>
+      </w:r>
+      <w:r>
+        <w:rPr>
+          <w:rFonts w:ascii="Calibri" w:hAnsi="Calibri" w:cs="Calibri"/>
+          <w:u w:val="single"/>
+        </w:rPr>
+        <w:tab/>
+      </w:r>
+      <w:r>
+        <w:rPr>
+          <w:rFonts w:ascii="Calibri" w:hAnsi="Calibri" w:cs="Calibri"/>
+          <w:u w:val="single"/>
+        </w:rPr>
+        <w:tab/>
+      </w:r>
+      <w:r>
+        <w:rPr>
+          <w:rFonts w:ascii="Calibri" w:hAnsi="Calibri" w:cs="Calibri"/>
+          <w:u w:val="single"/>
+        </w:rPr>
+        <w:tab/>
+      </w:r>
+    </w:p>
+    <w:p>
+      <w:pPr>
+        <w:pStyle w:val="Corpotesto"/>
+        <w:spacing w:before="40" w:after="40" w:line="240" w:lineRule="auto"/>
+        <w:ind w:left="0" w:right="56"/>
+        <w:rPr>
+          <w:rFonts w:ascii="Arial" w:hAnsi="Arial" w:cs="Arial"/>
           <w:sz w:val="22"/>
           <w:szCs w:val="22"/>
         </w:rPr>
       </w:pPr>
-      <w:r>
-        <w:rPr>
-          <w:rFonts w:ascii="Century Gothic" w:hAnsi="Century Gothic" w:cs="Century Gothic"/>
-          <w:b/>
-          <w:bCs/>
-          <w:sz w:val="22"/>
-          <w:szCs w:val="22"/>
-        </w:rPr>
-        <w:t>ALLEGATO 1 MODALITA’ DI SPONSORIZZAZIONE E CORRISPETTIVO</w:t>
-      </w:r>
-    </w:p>
-    <w:p>
-      <w:pPr>
-        <w:rPr>
-          <w:rFonts w:ascii="Century Gothic" w:hAnsi="Century Gothic" w:cs="Century Gothic"/>
-          <w:b/>
-          <w:bCs/>
-          <w:sz w:val="22"/>
-          <w:szCs w:val="22"/>
-        </w:rPr>
-      </w:pPr>
-    </w:p>
-    <w:p>
-      <w:pPr>
-        <w:jc w:val="center"/>
-        <w:rPr>
-          <w:rFonts w:ascii="Century Gothic" w:hAnsi="Century Gothic" w:cs="Century Gothic"/>
-          <w:b/>
-          <w:sz w:val="22"/>
-          <w:szCs w:val="22"/>
-        </w:rPr>
-      </w:pPr>
-      <w:r>
-        <w:rPr>
-          <w:rFonts w:ascii="Century Gothic" w:hAnsi="Century Gothic" w:cs="Century Gothic"/>
-          <w:b/>
-          <w:color w:val="FF0000"/>
-          <w:sz w:val="22"/>
-          <w:szCs w:val="22"/>
-        </w:rPr>
-        <w:t>TITOLO – DATA – LUOGO EVENTO</w:t>
-      </w:r>
-    </w:p>
-    <w:tbl>
-      <w:tblPr>
-        <w:tblW w:w="10799" w:type="dxa"/>
-        <w:jc w:val="center"/>
-        <w:tblLayout w:type="fixed"/>
-        <w:tblLook w:val="0000" w:firstRow="0" w:lastRow="0" w:firstColumn="0" w:lastColumn="0" w:noHBand="0" w:noVBand="0"/>
-      </w:tblPr>
-      <w:tblGrid>
-        <w:gridCol w:w="4226"/>
-        <w:gridCol w:w="6573"/>
-      </w:tblGrid>
-      <w:tr>
-        <w:trPr>
-          <w:trHeight w:val="242"/>
-          <w:jc w:val="center"/>
-        </w:trPr>
-        <w:tc>
-          <w:tcPr>
-            <w:tcW w:w="4226" w:type="dxa"/>
-            <w:tcBorders>
-              <w:top w:val="single" w:sz="4" w:space="0" w:color="000000"/>
-              <w:left w:val="single" w:sz="4" w:space="0" w:color="000000"/>
-              <w:bottom w:val="single" w:sz="4" w:space="0" w:color="000000"/>
-              <w:right w:val="single" w:sz="4" w:space="0" w:color="000000"/>
-            </w:tcBorders>
-          </w:tcPr>
-          <w:p>
-            <w:pPr>
-              <w:jc w:val="both"/>
-              <w:rPr>
-                <w:rFonts w:ascii="Century Gothic" w:hAnsi="Century Gothic" w:cs="Century Gothic"/>
-                <w:sz w:val="22"/>
-                <w:szCs w:val="22"/>
-              </w:rPr>
-            </w:pPr>
-            <w:r>
-              <w:rPr>
-                <w:rFonts w:ascii="Century Gothic" w:hAnsi="Century Gothic" w:cs="Century Gothic"/>
-                <w:sz w:val="22"/>
-                <w:szCs w:val="22"/>
-              </w:rPr>
-              <w:t>TITOLO</w:t>
-            </w:r>
-          </w:p>
-        </w:tc>
-        <w:tc>
-          <w:tcPr>
-            <w:tcW w:w="6573" w:type="dxa"/>
-            <w:tcBorders>
-              <w:top w:val="single" w:sz="4" w:space="0" w:color="000000"/>
-              <w:left w:val="single" w:sz="4" w:space="0" w:color="000000"/>
-              <w:bottom w:val="single" w:sz="4" w:space="0" w:color="000000"/>
-              <w:right w:val="single" w:sz="4" w:space="0" w:color="000000"/>
-            </w:tcBorders>
-          </w:tcPr>
-          <w:p>
-            <w:pPr>
-              <w:snapToGrid w:val="0"/>
-              <w:jc w:val="both"/>
-              <w:rPr>
-                <w:rFonts w:ascii="Century Gothic" w:hAnsi="Century Gothic" w:cs="Century Gothic"/>
-                <w:b/>
-                <w:sz w:val="22"/>
-                <w:szCs w:val="22"/>
-              </w:rPr>
-            </w:pPr>
-            <w:r>
-              <w:rPr>
-                <w:rFonts w:ascii="Century Gothic" w:hAnsi="Century Gothic" w:cs="Century Gothic"/>
-                <w:b/>
-                <w:sz w:val="22"/>
-                <w:szCs w:val="22"/>
-              </w:rPr>
-              <w:t>{{ event.name }}</w:t>
-            </w:r>
-          </w:p>
-        </w:tc>
-      </w:tr>
-      <w:tr>
-        <w:trPr>
-          <w:trHeight w:val="242"/>
-          <w:jc w:val="center"/>
-        </w:trPr>
-        <w:tc>
-          <w:tcPr>
-            <w:tcW w:w="4226" w:type="dxa"/>
-            <w:tcBorders>
-              <w:top w:val="single" w:sz="4" w:space="0" w:color="000000"/>
-              <w:left w:val="single" w:sz="4" w:space="0" w:color="000000"/>
-              <w:bottom w:val="single" w:sz="4" w:space="0" w:color="000000"/>
-              <w:right w:val="single" w:sz="4" w:space="0" w:color="000000"/>
-            </w:tcBorders>
-          </w:tcPr>
-          <w:p>
-            <w:pPr>
-              <w:jc w:val="both"/>
-              <w:rPr>
-                <w:rFonts w:ascii="Century Gothic" w:hAnsi="Century Gothic" w:cs="Century Gothic"/>
-                <w:sz w:val="22"/>
-                <w:szCs w:val="22"/>
-              </w:rPr>
-            </w:pPr>
-            <w:r>
-              <w:rPr>
-                <w:rFonts w:ascii="Century Gothic" w:hAnsi="Century Gothic" w:cs="Century Gothic"/>
-                <w:sz w:val="22"/>
-                <w:szCs w:val="22"/>
-              </w:rPr>
-              <w:t>DATA</w:t>
-            </w:r>
-          </w:p>
-        </w:tc>
-        <w:tc>
-          <w:tcPr>
-            <w:tcW w:w="6573" w:type="dxa"/>
-            <w:tcBorders>
-              <w:top w:val="single" w:sz="4" w:space="0" w:color="000000"/>
-              <w:left w:val="single" w:sz="4" w:space="0" w:color="000000"/>
-              <w:bottom w:val="single" w:sz="4" w:space="0" w:color="000000"/>
-              <w:right w:val="single" w:sz="4" w:space="0" w:color="000000"/>
-            </w:tcBorders>
-          </w:tcPr>
-          <w:p>
-            <w:pPr>
-              <w:snapToGrid w:val="0"/>
-              <w:jc w:val="both"/>
-              <w:rPr>
-                <w:rFonts w:ascii="Century Gothic" w:hAnsi="Century Gothic" w:cs="Century Gothic"/>
-                <w:b/>
-                <w:sz w:val="22"/>
-                <w:szCs w:val="22"/>
-                <w:lang w:val="en-US"/>
-              </w:rPr>
-            </w:pPr>
-            <w:proofErr w:type="gramStart"/>
-            <w:r>
-              <w:rPr>
-                <w:rFonts w:ascii="Century Gothic" w:hAnsi="Century Gothic" w:cs="Century Gothic"/>
-                <w:b/>
-                <w:sz w:val="22"/>
-                <w:szCs w:val="22"/>
-                <w:lang w:val="en-US"/>
-              </w:rPr>
-              <w:t xml:space="preserve">{{ </w:t>
-            </w:r>
-            <w:proofErr w:type="spellStart"/>
-            <w:r>
-              <w:rPr>
-                <w:rFonts w:ascii="Century Gothic" w:hAnsi="Century Gothic" w:cs="Century Gothic"/>
-                <w:b/>
-                <w:sz w:val="22"/>
-                <w:szCs w:val="22"/>
-                <w:lang w:val="en-US"/>
-              </w:rPr>
-              <w:t>event</w:t>
-            </w:r>
-            <w:proofErr w:type="gramEnd"/>
-            <w:r>
-              <w:rPr>
-                <w:rFonts w:ascii="Century Gothic" w:hAnsi="Century Gothic" w:cs="Century Gothic"/>
-                <w:b/>
-                <w:sz w:val="22"/>
-                <w:szCs w:val="22"/>
-                <w:lang w:val="en-US"/>
-              </w:rPr>
-              <w:t>.start_date|format_date</w:t>
-            </w:r>
-            <w:proofErr w:type="spellEnd"/>
-            <w:r>
-              <w:rPr>
-                <w:rFonts w:ascii="Century Gothic" w:hAnsi="Century Gothic" w:cs="Century Gothic"/>
-                <w:b/>
-                <w:sz w:val="22"/>
-                <w:szCs w:val="22"/>
-                <w:lang w:val="en-US"/>
-              </w:rPr>
-              <w:t xml:space="preserve"> }}</w:t>
-            </w:r>
-          </w:p>
-        </w:tc>
-      </w:tr>
-      <w:tr>
-        <w:trPr>
-          <w:trHeight w:val="242"/>
-          <w:jc w:val="center"/>
-        </w:trPr>
-        <w:tc>
-          <w:tcPr>
-            <w:tcW w:w="4226" w:type="dxa"/>
-            <w:tcBorders>
-              <w:top w:val="single" w:sz="4" w:space="0" w:color="000000"/>
-              <w:left w:val="single" w:sz="4" w:space="0" w:color="000000"/>
-              <w:bottom w:val="single" w:sz="4" w:space="0" w:color="000000"/>
-              <w:right w:val="single" w:sz="4" w:space="0" w:color="000000"/>
-            </w:tcBorders>
-          </w:tcPr>
-          <w:p>
-            <w:pPr>
-              <w:jc w:val="both"/>
-              <w:rPr>
-                <w:rFonts w:ascii="Century Gothic" w:hAnsi="Century Gothic" w:cs="Century Gothic"/>
-                <w:sz w:val="22"/>
-                <w:szCs w:val="22"/>
-              </w:rPr>
-            </w:pPr>
-            <w:r>
-              <w:rPr>
-                <w:rFonts w:ascii="Century Gothic" w:hAnsi="Century Gothic" w:cs="Century Gothic"/>
-                <w:sz w:val="22"/>
-                <w:szCs w:val="22"/>
-              </w:rPr>
-              <w:t xml:space="preserve">LUOGO </w:t>
-            </w:r>
-          </w:p>
-        </w:tc>
-        <w:tc>
-          <w:tcPr>
-            <w:tcW w:w="6573" w:type="dxa"/>
-            <w:tcBorders>
-              <w:top w:val="single" w:sz="4" w:space="0" w:color="000000"/>
-              <w:left w:val="single" w:sz="4" w:space="0" w:color="000000"/>
-              <w:bottom w:val="single" w:sz="4" w:space="0" w:color="000000"/>
-              <w:right w:val="single" w:sz="4" w:space="0" w:color="000000"/>
-            </w:tcBorders>
-          </w:tcPr>
-          <w:p>
-            <w:pPr>
-              <w:snapToGrid w:val="0"/>
-              <w:jc w:val="both"/>
-              <w:rPr>
-                <w:rFonts w:ascii="Century Gothic" w:hAnsi="Century Gothic" w:cs="Century Gothic"/>
-                <w:b/>
-                <w:sz w:val="22"/>
-                <w:szCs w:val="22"/>
-              </w:rPr>
-            </w:pPr>
-            <w:r>
-              <w:rPr>
-                <w:rFonts w:ascii="Century Gothic" w:hAnsi="Century Gothic" w:cs="Century Gothic"/>
-                <w:b/>
-                <w:sz w:val="22"/>
-                <w:szCs w:val="22"/>
-              </w:rPr>
-              <w:t>{{ event.location }}</w:t>
-            </w:r>
-          </w:p>
-        </w:tc>
-      </w:tr>
-      <w:tr>
-        <w:trPr>
-          <w:trHeight w:val="242"/>
-          <w:jc w:val="center"/>
-        </w:trPr>
-        <w:tc>
-          <w:tcPr>
-            <w:tcW w:w="4226" w:type="dxa"/>
-            <w:tcBorders>
-              <w:top w:val="single" w:sz="4" w:space="0" w:color="000000"/>
-              <w:left w:val="single" w:sz="4" w:space="0" w:color="000000"/>
-              <w:bottom w:val="single" w:sz="4" w:space="0" w:color="000000"/>
-              <w:right w:val="single" w:sz="4" w:space="0" w:color="000000"/>
-            </w:tcBorders>
-          </w:tcPr>
-          <w:p>
-            <w:pPr>
-              <w:jc w:val="both"/>
-              <w:rPr>
-                <w:rFonts w:ascii="Century Gothic" w:hAnsi="Century Gothic" w:cs="Century Gothic"/>
-                <w:sz w:val="22"/>
-                <w:szCs w:val="22"/>
-              </w:rPr>
-            </w:pPr>
-            <w:r>
-              <w:rPr>
-                <w:rFonts w:ascii="Century Gothic" w:hAnsi="Century Gothic" w:cs="Century Gothic"/>
-                <w:sz w:val="22"/>
-                <w:szCs w:val="22"/>
-              </w:rPr>
-              <w:t>SEDE ED INDIRIZZO</w:t>
-            </w:r>
-          </w:p>
-        </w:tc>
-        <w:tc>
-          <w:tcPr>
-            <w:tcW w:w="6573" w:type="dxa"/>
-            <w:tcBorders>
-              <w:top w:val="single" w:sz="4" w:space="0" w:color="000000"/>
-              <w:left w:val="single" w:sz="4" w:space="0" w:color="000000"/>
-              <w:bottom w:val="single" w:sz="4" w:space="0" w:color="000000"/>
-              <w:right w:val="single" w:sz="4" w:space="0" w:color="000000"/>
-            </w:tcBorders>
-          </w:tcPr>
-          <w:p>
-            <w:pPr>
-              <w:snapToGrid w:val="0"/>
-              <w:jc w:val="both"/>
-              <w:rPr>
-                <w:rFonts w:ascii="Century Gothic" w:hAnsi="Century Gothic" w:cs="Century Gothic"/>
-                <w:b/>
-                <w:sz w:val="22"/>
-                <w:szCs w:val="22"/>
-                <w:lang w:val="en-US"/>
-              </w:rPr>
-            </w:pPr>
-            <w:proofErr w:type="gramStart"/>
-            <w:r>
-              <w:rPr>
-                <w:rFonts w:ascii="Century Gothic" w:hAnsi="Century Gothic" w:cs="Century Gothic"/>
-                <w:b/>
-                <w:sz w:val="22"/>
-                <w:szCs w:val="22"/>
-                <w:lang w:val="en-US"/>
-              </w:rPr>
-              <w:t xml:space="preserve">{{ </w:t>
-            </w:r>
-            <w:proofErr w:type="spellStart"/>
-            <w:r>
-              <w:rPr>
-                <w:rFonts w:ascii="Century Gothic" w:hAnsi="Century Gothic" w:cs="Century Gothic"/>
-                <w:b/>
-                <w:sz w:val="22"/>
-                <w:szCs w:val="22"/>
-                <w:lang w:val="en-US"/>
-              </w:rPr>
-              <w:t>event</w:t>
-            </w:r>
-            <w:proofErr w:type="gramEnd"/>
-            <w:r>
-              <w:rPr>
-                <w:rFonts w:ascii="Century Gothic" w:hAnsi="Century Gothic" w:cs="Century Gothic"/>
-                <w:b/>
-                <w:sz w:val="22"/>
-                <w:szCs w:val="22"/>
-                <w:lang w:val="en-US"/>
-              </w:rPr>
-              <w:t>.venue_address|</w:t>
-            </w:r>
-            <w:proofErr w:type="gramStart"/>
-            <w:r>
-              <w:rPr>
-                <w:rFonts w:ascii="Century Gothic" w:hAnsi="Century Gothic" w:cs="Century Gothic"/>
-                <w:b/>
-                <w:sz w:val="22"/>
-                <w:szCs w:val="22"/>
-                <w:lang w:val="en-US"/>
-              </w:rPr>
-              <w:t>default</w:t>
-            </w:r>
-            <w:proofErr w:type="spellEnd"/>
-            <w:r>
-              <w:rPr>
-                <w:rFonts w:ascii="Century Gothic" w:hAnsi="Century Gothic" w:cs="Century Gothic"/>
-                <w:b/>
-                <w:sz w:val="22"/>
-                <w:szCs w:val="22"/>
-                <w:lang w:val="en-US"/>
-              </w:rPr>
-              <w:t>(</w:t>
-            </w:r>
-            <w:proofErr w:type="spellStart"/>
-            <w:r>
-              <w:rPr>
-                <w:rFonts w:ascii="Century Gothic" w:hAnsi="Century Gothic" w:cs="Century Gothic"/>
-                <w:b/>
-                <w:sz w:val="22"/>
-                <w:szCs w:val="22"/>
-                <w:lang w:val="en-US"/>
-              </w:rPr>
-              <w:t>event.location</w:t>
-            </w:r>
-            <w:proofErr w:type="spellEnd"/>
-            <w:proofErr w:type="gramEnd"/>
-            <w:r>
-              <w:rPr>
-                <w:rFonts w:ascii="Century Gothic" w:hAnsi="Century Gothic" w:cs="Century Gothic"/>
-                <w:b/>
-                <w:sz w:val="22"/>
-                <w:szCs w:val="22"/>
-                <w:lang w:val="en-US"/>
-              </w:rPr>
-              <w:t>, true) }}</w:t>
-            </w:r>
-          </w:p>
-        </w:tc>
-      </w:tr>
-    </w:tbl>
-    <w:p>
-      <w:pPr>
-        <w:rPr>
-          <w:rFonts w:ascii="Century Gothic" w:hAnsi="Century Gothic" w:cs="Century Gothic"/>
-          <w:sz w:val="22"/>
-          <w:szCs w:val="22"/>
-          <w:lang w:val="en-US"/>
-        </w:rPr>
-      </w:pPr>
-    </w:p>
-    <w:p>
-      <w:pPr>
-        <w:rPr>
-          <w:rFonts w:ascii="Century Gothic" w:hAnsi="Century Gothic" w:cs="Century Gothic"/>
-          <w:sz w:val="22"/>
-          <w:szCs w:val="22"/>
-          <w:lang w:val="en-US"/>
-        </w:rPr>
-      </w:pPr>
-    </w:p>
-    <w:p>
-      <w:pPr>
-        <w:jc w:val="both"/>
-        <w:rPr>
-          <w:rFonts w:ascii="Century Gothic" w:hAnsi="Century Gothic" w:cs="Century Gothic"/>
-          <w:b/>
-          <w:sz w:val="22"/>
-          <w:szCs w:val="22"/>
-          <w:lang w:val="en-US"/>
-        </w:rPr>
-      </w:pPr>
-    </w:p>
-    <w:p>
-      <w:pPr>
-        <w:jc w:val="center"/>
-      </w:pPr>
-      <w:r>
-        <w:t xml:space="preserve">MODALITà DI SPONSORIZZAZIONE, FATTURAZIONE E PAGAMENTO </w:t>
-      </w:r>
-    </w:p>
-    <w:tbl>
-      <w:tblPr>
-        <w:tblW w:w="10799" w:type="dxa"/>
-        <w:jc w:val="center"/>
-        <w:tblLayout w:type="fixed"/>
-        <w:tblLook w:val="0000" w:firstRow="0" w:lastRow="0" w:firstColumn="0" w:lastColumn="0" w:noHBand="0" w:noVBand="0"/>
-      </w:tblPr>
-      <w:tblGrid>
-        <w:gridCol w:w="4226"/>
-        <w:gridCol w:w="6573"/>
-      </w:tblGrid>
-      <w:tr>
-        <w:trPr>
-          <w:trHeight w:val="242"/>
-          <w:jc w:val="center"/>
-        </w:trPr>
-        <w:tc>
-          <w:tcPr>
-            <w:tcW w:w="4226" w:type="dxa"/>
-            <w:tcBorders>
-              <w:top w:val="single" w:sz="4" w:space="0" w:color="000000"/>
-              <w:left w:val="single" w:sz="4" w:space="0" w:color="000000"/>
-              <w:bottom w:val="single" w:sz="4" w:space="0" w:color="000000"/>
-              <w:right w:val="single" w:sz="4" w:space="0" w:color="000000"/>
-            </w:tcBorders>
-          </w:tcPr>
-          <w:p>
-            <w:pPr>
-              <w:jc w:val="both"/>
-              <w:rPr>
-                <w:rFonts w:ascii="Century Gothic" w:hAnsi="Century Gothic" w:cs="Century Gothic"/>
-                <w:sz w:val="22"/>
-                <w:szCs w:val="22"/>
-              </w:rPr>
-            </w:pPr>
-            <w:r>
-              <w:rPr>
-                <w:rFonts w:ascii="Century Gothic" w:hAnsi="Century Gothic" w:cs="Century Gothic"/>
-                <w:caps/>
-                <w:sz w:val="22"/>
-                <w:szCs w:val="22"/>
-              </w:rPr>
-              <w:t xml:space="preserve">MODALITà DI SPONSORIZZAZIONE SCELTA </w:t>
-            </w:r>
-          </w:p>
-        </w:tc>
-        <w:tc>
-          <w:tcPr>
-            <w:tcW w:w="6573" w:type="dxa"/>
-            <w:tcBorders>
-              <w:top w:val="single" w:sz="4" w:space="0" w:color="000000"/>
-              <w:left w:val="single" w:sz="4" w:space="0" w:color="000000"/>
-              <w:bottom w:val="single" w:sz="4" w:space="0" w:color="000000"/>
-              <w:right w:val="single" w:sz="4" w:space="0" w:color="000000"/>
-            </w:tcBorders>
-          </w:tcPr>
-          <w:p>
-            <w:pPr>
-              <w:snapToGrid w:val="0"/>
-              <w:jc w:val="both"/>
-              <w:rPr>
-                <w:rFonts w:ascii="Century Gothic" w:hAnsi="Century Gothic" w:cs="Century Gothic"/>
-                <w:sz w:val="22"/>
-                <w:szCs w:val="22"/>
-                <w:lang w:val="en-US"/>
-              </w:rPr>
-            </w:pPr>
-            <w:proofErr w:type="gramStart"/>
-            <w:r>
-              <w:rPr>
-                <w:rFonts w:ascii="Century Gothic" w:hAnsi="Century Gothic" w:cs="Century Gothic"/>
-                <w:sz w:val="22"/>
-                <w:szCs w:val="22"/>
-                <w:lang w:val="en-US"/>
-              </w:rPr>
-              <w:t xml:space="preserve">{{ </w:t>
-            </w:r>
-            <w:proofErr w:type="spellStart"/>
-            <w:r>
-              <w:rPr>
-                <w:rFonts w:ascii="Century Gothic" w:hAnsi="Century Gothic" w:cs="Century Gothic"/>
-                <w:sz w:val="22"/>
-                <w:szCs w:val="22"/>
-                <w:lang w:val="en-US"/>
-              </w:rPr>
-              <w:t>services</w:t>
-            </w:r>
-            <w:proofErr w:type="gramEnd"/>
-            <w:r>
-              <w:rPr>
-                <w:rFonts w:ascii="Century Gothic" w:hAnsi="Century Gothic" w:cs="Century Gothic"/>
-                <w:sz w:val="22"/>
-                <w:szCs w:val="22"/>
-                <w:lang w:val="en-US"/>
-              </w:rPr>
-              <w:t>_list|</w:t>
-            </w:r>
-            <w:proofErr w:type="gramStart"/>
-            <w:r>
-              <w:rPr>
-                <w:rFonts w:ascii="Century Gothic" w:hAnsi="Century Gothic" w:cs="Century Gothic"/>
-                <w:sz w:val="22"/>
-                <w:szCs w:val="22"/>
-                <w:lang w:val="en-US"/>
-              </w:rPr>
-              <w:t>default</w:t>
-            </w:r>
-            <w:proofErr w:type="spellEnd"/>
-            <w:r>
-              <w:rPr>
-                <w:rFonts w:ascii="Century Gothic" w:hAnsi="Century Gothic" w:cs="Century Gothic"/>
-                <w:sz w:val="22"/>
-                <w:szCs w:val="22"/>
-                <w:lang w:val="en-US"/>
-              </w:rPr>
-              <w:t>(</w:t>
-            </w:r>
-            <w:proofErr w:type="gramEnd"/>
-            <w:r>
-              <w:rPr>
-                <w:rFonts w:ascii="Century Gothic" w:hAnsi="Century Gothic" w:cs="Century Gothic"/>
-                <w:sz w:val="22"/>
-                <w:szCs w:val="22"/>
-                <w:lang w:val="en-US"/>
-              </w:rPr>
-              <w:t>'________________', true) }}</w:t>
-            </w:r>
-          </w:p>
-        </w:tc>
-      </w:tr>
-      <w:tr>
-        <w:trPr>
-          <w:trHeight w:val="242"/>
-          <w:jc w:val="center"/>
-        </w:trPr>
-        <w:tc>
-          <w:tcPr>
-            <w:tcW w:w="4226" w:type="dxa"/>
-            <w:tcBorders>
-              <w:top w:val="single" w:sz="4" w:space="0" w:color="000000"/>
-              <w:left w:val="single" w:sz="4" w:space="0" w:color="000000"/>
-              <w:bottom w:val="single" w:sz="4" w:space="0" w:color="000000"/>
-              <w:right w:val="single" w:sz="4" w:space="0" w:color="000000"/>
-            </w:tcBorders>
-          </w:tcPr>
-          <w:p>
-            <w:pPr>
-              <w:jc w:val="right"/>
-              <w:rPr>
-                <w:rFonts w:ascii="Century Gothic" w:hAnsi="Century Gothic" w:cs="Century Gothic"/>
-                <w:caps/>
-                <w:sz w:val="22"/>
-                <w:szCs w:val="22"/>
-              </w:rPr>
-            </w:pPr>
-            <w:r>
-              <w:rPr>
-                <w:rFonts w:ascii="Century Gothic" w:hAnsi="Century Gothic" w:cs="Century Gothic"/>
-                <w:caps/>
-                <w:sz w:val="22"/>
-                <w:szCs w:val="22"/>
-              </w:rPr>
-              <w:t>compenso - sponsorizzazione</w:t>
-            </w:r>
-          </w:p>
-        </w:tc>
-        <w:tc>
-          <w:tcPr>
-            <w:tcW w:w="6573" w:type="dxa"/>
-            <w:tcBorders>
-              <w:top w:val="single" w:sz="4" w:space="0" w:color="000000"/>
-              <w:left w:val="single" w:sz="4" w:space="0" w:color="000000"/>
-              <w:bottom w:val="single" w:sz="4" w:space="0" w:color="000000"/>
-              <w:right w:val="single" w:sz="4" w:space="0" w:color="000000"/>
-            </w:tcBorders>
-          </w:tcPr>
-          <w:p>
-            <w:pPr>
-              <w:snapToGrid w:val="0"/>
-              <w:jc w:val="both"/>
-              <w:rPr>
-                <w:rFonts w:ascii="Century Gothic" w:hAnsi="Century Gothic" w:cs="Century Gothic"/>
-                <w:caps/>
-                <w:sz w:val="22"/>
-                <w:szCs w:val="22"/>
-              </w:rPr>
-            </w:pPr>
-            <w:r>
-              <w:rPr>
-                <w:rFonts w:ascii="Century Gothic" w:hAnsi="Century Gothic" w:cs="Century Gothic"/>
-                <w:caps/>
-                <w:sz w:val="22"/>
-                <w:szCs w:val="22"/>
-              </w:rPr>
-              <w:t>€ {{ contract.subtotal|format_currency }}</w:t>
-            </w:r>
-          </w:p>
-        </w:tc>
-      </w:tr>
-      <w:tr>
-        <w:trPr>
-          <w:trHeight w:val="242"/>
-          <w:jc w:val="center"/>
-        </w:trPr>
-        <w:tc>
-          <w:tcPr>
-            <w:tcW w:w="4226" w:type="dxa"/>
-            <w:tcBorders>
-              <w:top w:val="single" w:sz="4" w:space="0" w:color="000000"/>
-              <w:left w:val="single" w:sz="4" w:space="0" w:color="000000"/>
-              <w:bottom w:val="single" w:sz="4" w:space="0" w:color="000000"/>
-              <w:right w:val="single" w:sz="4" w:space="0" w:color="000000"/>
-            </w:tcBorders>
-          </w:tcPr>
-          <w:p>
-            <w:pPr>
-              <w:jc w:val="right"/>
-              <w:rPr>
-                <w:rFonts w:ascii="Century Gothic" w:hAnsi="Century Gothic" w:cs="Century Gothic"/>
-                <w:caps/>
-                <w:sz w:val="22"/>
-                <w:szCs w:val="22"/>
-              </w:rPr>
-            </w:pPr>
-            <w:r>
-              <w:rPr>
-                <w:rFonts w:ascii="Century Gothic" w:hAnsi="Century Gothic" w:cs="Century Gothic"/>
-                <w:caps/>
-                <w:sz w:val="22"/>
-                <w:szCs w:val="22"/>
-              </w:rPr>
-              <w:t>IVA 22%</w:t>
-            </w:r>
-          </w:p>
-        </w:tc>
-        <w:tc>
-          <w:tcPr>
-            <w:tcW w:w="6573" w:type="dxa"/>
-            <w:tcBorders>
-              <w:top w:val="single" w:sz="4" w:space="0" w:color="000000"/>
-              <w:left w:val="single" w:sz="4" w:space="0" w:color="000000"/>
-              <w:bottom w:val="single" w:sz="4" w:space="0" w:color="000000"/>
-              <w:right w:val="single" w:sz="4" w:space="0" w:color="000000"/>
-            </w:tcBorders>
-          </w:tcPr>
-          <w:p>
-            <w:pPr>
-              <w:snapToGrid w:val="0"/>
-              <w:jc w:val="both"/>
-              <w:rPr>
-                <w:rFonts w:ascii="Century Gothic" w:hAnsi="Century Gothic" w:cs="Century Gothic"/>
-                <w:caps/>
-                <w:sz w:val="22"/>
-                <w:szCs w:val="22"/>
-                <w:lang w:val="en-US"/>
-              </w:rPr>
-            </w:pPr>
-            <w:r>
-              <w:rPr>
-                <w:rFonts w:ascii="Century Gothic" w:hAnsi="Century Gothic" w:cs="Century Gothic"/>
-                <w:caps/>
-                <w:sz w:val="22"/>
-                <w:szCs w:val="22"/>
-                <w:lang w:val="en-US"/>
-              </w:rPr>
-              <w:t xml:space="preserve">€ </w:t>
-            </w:r>
-            <w:proofErr w:type="gramStart"/>
-            <w:r>
-              <w:rPr>
-                <w:rFonts w:ascii="Century Gothic" w:hAnsi="Century Gothic" w:cs="Century Gothic"/>
-                <w:caps/>
-                <w:sz w:val="22"/>
-                <w:szCs w:val="22"/>
-                <w:lang w:val="en-US"/>
-              </w:rPr>
-              <w:t>{{ contract.vat</w:t>
-            </w:r>
-            <w:proofErr w:type="gramEnd"/>
-            <w:r>
-              <w:rPr>
-                <w:rFonts w:ascii="Century Gothic" w:hAnsi="Century Gothic" w:cs="Century Gothic"/>
-                <w:caps/>
-                <w:sz w:val="22"/>
-                <w:szCs w:val="22"/>
-                <w:lang w:val="en-US"/>
-              </w:rPr>
-              <w:t>_amount|format_currency }}</w:t>
-            </w:r>
-          </w:p>
-        </w:tc>
-      </w:tr>
-      <w:tr>
-        <w:trPr>
-          <w:trHeight w:val="242"/>
-          <w:jc w:val="center"/>
-        </w:trPr>
-        <w:tc>
-          <w:tcPr>
-            <w:tcW w:w="4226" w:type="dxa"/>
-            <w:tcBorders>
-              <w:top w:val="single" w:sz="4" w:space="0" w:color="000000"/>
-              <w:left w:val="single" w:sz="4" w:space="0" w:color="000000"/>
-              <w:bottom w:val="single" w:sz="4" w:space="0" w:color="000000"/>
-              <w:right w:val="single" w:sz="4" w:space="0" w:color="000000"/>
-            </w:tcBorders>
-          </w:tcPr>
-          <w:p>
-            <w:pPr>
-              <w:jc w:val="right"/>
-              <w:rPr>
-                <w:rFonts w:ascii="Century Gothic" w:hAnsi="Century Gothic" w:cs="Century Gothic"/>
-                <w:caps/>
-                <w:sz w:val="22"/>
-                <w:szCs w:val="22"/>
-              </w:rPr>
-            </w:pPr>
-            <w:r>
-              <w:rPr>
-                <w:rFonts w:ascii="Century Gothic" w:hAnsi="Century Gothic" w:cs="Century Gothic"/>
-                <w:caps/>
-                <w:sz w:val="22"/>
-                <w:szCs w:val="22"/>
-              </w:rPr>
-              <w:t xml:space="preserve">totale fattura </w:t>
-            </w:r>
-          </w:p>
-        </w:tc>
-        <w:tc>
-          <w:tcPr>
-            <w:tcW w:w="6573" w:type="dxa"/>
-            <w:tcBorders>
-              <w:top w:val="single" w:sz="4" w:space="0" w:color="000000"/>
-              <w:left w:val="single" w:sz="4" w:space="0" w:color="000000"/>
-              <w:bottom w:val="single" w:sz="4" w:space="0" w:color="000000"/>
-              <w:right w:val="single" w:sz="4" w:space="0" w:color="000000"/>
-            </w:tcBorders>
-          </w:tcPr>
-          <w:p>
-            <w:pPr>
-              <w:jc w:val="both"/>
-              <w:rPr>
-                <w:rFonts w:ascii="Century Gothic" w:hAnsi="Century Gothic" w:cs="Century Gothic"/>
-                <w:sz w:val="22"/>
-                <w:szCs w:val="22"/>
-              </w:rPr>
-            </w:pPr>
-            <w:r>
-              <w:rPr>
-                <w:rFonts w:ascii="Century Gothic" w:eastAsia="Century Gothic" w:hAnsi="Century Gothic" w:cs="Century Gothic"/>
-                <w:b/>
-                <w:sz w:val="22"/>
-                <w:szCs w:val="22"/>
-              </w:rPr>
-              <w:t>€ {{ contract.total|format_currency }}</w:t>
-            </w:r>
-          </w:p>
-        </w:tc>
-      </w:tr>
-      <w:tr>
-        <w:trPr>
-          <w:trHeight w:val="242"/>
-          <w:jc w:val="center"/>
-        </w:trPr>
-        <w:tc>
-          <w:tcPr>
-            <w:tcW w:w="4226" w:type="dxa"/>
-            <w:tcBorders>
-              <w:top w:val="single" w:sz="4" w:space="0" w:color="000000"/>
-              <w:left w:val="single" w:sz="4" w:space="0" w:color="000000"/>
-              <w:bottom w:val="single" w:sz="4" w:space="0" w:color="000000"/>
-              <w:right w:val="single" w:sz="4" w:space="0" w:color="000000"/>
-            </w:tcBorders>
-          </w:tcPr>
-          <w:p>
-            <w:pPr>
-              <w:jc w:val="both"/>
-              <w:rPr>
-                <w:rFonts w:ascii="Century Gothic" w:hAnsi="Century Gothic" w:cs="Century Gothic"/>
-                <w:sz w:val="22"/>
-                <w:szCs w:val="22"/>
-              </w:rPr>
-            </w:pPr>
-            <w:r>
-              <w:rPr>
-                <w:rFonts w:ascii="Century Gothic" w:hAnsi="Century Gothic" w:cs="Century Gothic"/>
-                <w:sz w:val="22"/>
-                <w:szCs w:val="22"/>
-              </w:rPr>
-              <w:t xml:space="preserve">DATI PER LA FATTURAZIONE </w:t>
-            </w:r>
-          </w:p>
-          <w:p>
-            <w:pPr>
-              <w:jc w:val="both"/>
-            </w:pPr>
-            <w:r>
-              <w:rPr>
-                <w:rFonts w:ascii="Century Gothic" w:hAnsi="Century Gothic" w:cs="Century Gothic"/>
-                <w:sz w:val="22"/>
-                <w:szCs w:val="22"/>
-              </w:rPr>
-              <w:t xml:space="preserve">(la fattura per l’importo concordato verrà emessa dalla Segreteria organizzativa) </w:t>
-            </w:r>
-          </w:p>
-        </w:tc>
-        <w:tc>
-          <w:tcPr>
-            <w:tcW w:w="6573" w:type="dxa"/>
-            <w:tcBorders>
-              <w:top w:val="single" w:sz="4" w:space="0" w:color="000000"/>
-              <w:left w:val="single" w:sz="4" w:space="0" w:color="000000"/>
-              <w:bottom w:val="single" w:sz="4" w:space="0" w:color="000000"/>
-              <w:right w:val="single" w:sz="4" w:space="0" w:color="000000"/>
-            </w:tcBorders>
-          </w:tcPr>
-          <w:p>
-            <w:pPr>
-              <w:snapToGrid w:val="0"/>
-              <w:jc w:val="both"/>
-              <w:rPr>
-                <w:rFonts w:ascii="Century Gothic" w:hAnsi="Century Gothic" w:cs="Century Gothic"/>
-                <w:sz w:val="22"/>
-                <w:szCs w:val="22"/>
-              </w:rPr>
-            </w:pPr>
-            <w:r>
-              <w:rPr>
-                <w:rFonts w:ascii="Century Gothic" w:hAnsi="Century Gothic" w:cs="Century Gothic"/>
-                <w:sz w:val="22"/>
-                <w:szCs w:val="22"/>
-              </w:rPr>
-              <w:t>{{ sponsor.legal_name }}</w:t>
-            </w:r>
-            <w:r>
-              <w:rPr>
-                <w:rFonts w:ascii="Century Gothic" w:hAnsi="Century Gothic" w:cs="Century Gothic"/>
-                <w:sz w:val="22"/>
-                <w:szCs w:val="22"/>
-              </w:rPr>
-              <w:br/>
-              <w:t>{{ sponsor.billing_full_address }}</w:t>
-            </w:r>
-            <w:r>
-              <w:rPr>
-                <w:rFonts w:ascii="Century Gothic" w:hAnsi="Century Gothic" w:cs="Century Gothic"/>
-                <w:sz w:val="22"/>
-                <w:szCs w:val="22"/>
-              </w:rPr>
-              <w:br/>
-              <w:t>P.IVA: {{ sponsor.vat_number }}</w:t>
-            </w:r>
-            <w:r>
-              <w:rPr>
-                <w:rFonts w:ascii="Century Gothic" w:hAnsi="Century Gothic" w:cs="Century Gothic"/>
-                <w:sz w:val="22"/>
-                <w:szCs w:val="22"/>
-              </w:rPr>
-              <w:br/>
-              <w:t>C.F.: {{ sponsor.tax_code }}</w:t>
-            </w:r>
-            <w:r>
-              <w:rPr>
-                <w:rFonts w:ascii="Century Gothic" w:hAnsi="Century Gothic" w:cs="Century Gothic"/>
-                <w:sz w:val="22"/>
-                <w:szCs w:val="22"/>
-              </w:rPr>
-              <w:br/>
-              <w:t>PEC: {{ sponsor.pec_email|default('________', true) }}</w:t>
-            </w:r>
-          </w:p>
-        </w:tc>
-      </w:tr>
-      <w:tr>
-        <w:trPr>
-          <w:trHeight w:val="242"/>
-          <w:jc w:val="center"/>
-        </w:trPr>
-        <w:tc>
-          <w:tcPr>
-            <w:tcW w:w="4226" w:type="dxa"/>
-            <w:tcBorders>
-              <w:top w:val="single" w:sz="4" w:space="0" w:color="000000"/>
-              <w:left w:val="single" w:sz="4" w:space="0" w:color="000000"/>
-              <w:bottom w:val="single" w:sz="4" w:space="0" w:color="000000"/>
-              <w:right w:val="single" w:sz="4" w:space="0" w:color="000000"/>
-            </w:tcBorders>
-          </w:tcPr>
-          <w:p>
-            <w:pPr>
-              <w:jc w:val="both"/>
-              <w:rPr>
-                <w:rFonts w:ascii="Century Gothic" w:hAnsi="Century Gothic" w:cs="Century Gothic"/>
-                <w:sz w:val="22"/>
-                <w:szCs w:val="22"/>
-              </w:rPr>
-            </w:pPr>
-            <w:r>
-              <w:rPr>
-                <w:rFonts w:ascii="Century Gothic" w:hAnsi="Century Gothic" w:cs="Century Gothic"/>
-                <w:sz w:val="22"/>
-                <w:szCs w:val="22"/>
-              </w:rPr>
-              <w:t>CODICE DESTINATARIO PER FATTURA ELETTRONICA</w:t>
-            </w:r>
-          </w:p>
-        </w:tc>
-        <w:tc>
-          <w:tcPr>
-            <w:tcW w:w="6573" w:type="dxa"/>
-            <w:tcBorders>
-              <w:top w:val="single" w:sz="4" w:space="0" w:color="000000"/>
-              <w:left w:val="single" w:sz="4" w:space="0" w:color="000000"/>
-              <w:bottom w:val="single" w:sz="4" w:space="0" w:color="000000"/>
-              <w:right w:val="single" w:sz="4" w:space="0" w:color="000000"/>
-            </w:tcBorders>
-          </w:tcPr>
-          <w:p>
-            <w:pPr>
-              <w:snapToGrid w:val="0"/>
-              <w:jc w:val="both"/>
-              <w:rPr>
-                <w:rFonts w:ascii="Century Gothic" w:hAnsi="Century Gothic" w:cs="Century Gothic"/>
-                <w:sz w:val="22"/>
-                <w:szCs w:val="22"/>
-                <w:lang w:val="en-US"/>
-              </w:rPr>
-            </w:pPr>
-            <w:proofErr w:type="gramStart"/>
-            <w:r>
-              <w:rPr>
-                <w:rFonts w:ascii="Century Gothic" w:hAnsi="Century Gothic" w:cs="Century Gothic"/>
-                <w:sz w:val="22"/>
-                <w:szCs w:val="22"/>
-                <w:lang w:val="en-US"/>
-              </w:rPr>
-              <w:t xml:space="preserve">{{ </w:t>
-            </w:r>
-            <w:proofErr w:type="spellStart"/>
-            <w:r>
-              <w:rPr>
-                <w:rFonts w:ascii="Century Gothic" w:hAnsi="Century Gothic" w:cs="Century Gothic"/>
-                <w:sz w:val="22"/>
-                <w:szCs w:val="22"/>
-                <w:lang w:val="en-US"/>
-              </w:rPr>
-              <w:t>sponsor.sdi</w:t>
-            </w:r>
-            <w:proofErr w:type="gramEnd"/>
-            <w:r>
-              <w:rPr>
-                <w:rFonts w:ascii="Century Gothic" w:hAnsi="Century Gothic" w:cs="Century Gothic"/>
-                <w:sz w:val="22"/>
-                <w:szCs w:val="22"/>
-                <w:lang w:val="en-US"/>
-              </w:rPr>
-              <w:t>_code|</w:t>
-            </w:r>
-            <w:proofErr w:type="gramStart"/>
-            <w:r>
-              <w:rPr>
-                <w:rFonts w:ascii="Century Gothic" w:hAnsi="Century Gothic" w:cs="Century Gothic"/>
-                <w:sz w:val="22"/>
-                <w:szCs w:val="22"/>
-                <w:lang w:val="en-US"/>
-              </w:rPr>
-              <w:t>default</w:t>
-            </w:r>
-            <w:proofErr w:type="spellEnd"/>
-            <w:r>
-              <w:rPr>
-                <w:rFonts w:ascii="Century Gothic" w:hAnsi="Century Gothic" w:cs="Century Gothic"/>
-                <w:sz w:val="22"/>
-                <w:szCs w:val="22"/>
-                <w:lang w:val="en-US"/>
-              </w:rPr>
-              <w:t>(</w:t>
-            </w:r>
-            <w:proofErr w:type="gramEnd"/>
-            <w:r>
-              <w:rPr>
-                <w:rFonts w:ascii="Century Gothic" w:hAnsi="Century Gothic" w:cs="Century Gothic"/>
-                <w:sz w:val="22"/>
-                <w:szCs w:val="22"/>
-                <w:lang w:val="en-US"/>
-              </w:rPr>
-              <w:t>'________', true) }}</w:t>
-            </w:r>
-          </w:p>
-        </w:tc>
-      </w:tr>
-      <w:tr>
-        <w:trPr>
-          <w:trHeight w:val="242"/>
-          <w:jc w:val="center"/>
-        </w:trPr>
-        <w:tc>
-          <w:tcPr>
-            <w:tcW w:w="4226" w:type="dxa"/>
-            <w:tcBorders>
-              <w:top w:val="single" w:sz="4" w:space="0" w:color="000000"/>
-              <w:left w:val="single" w:sz="4" w:space="0" w:color="000000"/>
-              <w:bottom w:val="single" w:sz="4" w:space="0" w:color="000000"/>
-              <w:right w:val="single" w:sz="4" w:space="0" w:color="000000"/>
-            </w:tcBorders>
-          </w:tcPr>
-          <w:p>
-            <w:pPr>
-              <w:jc w:val="both"/>
-              <w:rPr>
-                <w:rFonts w:ascii="Century Gothic" w:hAnsi="Century Gothic" w:cs="Century Gothic"/>
-                <w:sz w:val="22"/>
-                <w:szCs w:val="22"/>
-              </w:rPr>
-            </w:pPr>
-            <w:r>
-              <w:rPr>
-                <w:rFonts w:ascii="Century Gothic" w:hAnsi="Century Gothic" w:cs="Century Gothic"/>
-                <w:caps/>
-                <w:sz w:val="22"/>
-                <w:szCs w:val="22"/>
-              </w:rPr>
-              <w:t>MODALITà</w:t>
-            </w:r>
-            <w:r>
-              <w:rPr>
-                <w:rFonts w:ascii="Century Gothic" w:hAnsi="Century Gothic" w:cs="Century Gothic"/>
-                <w:sz w:val="22"/>
-                <w:szCs w:val="22"/>
-              </w:rPr>
-              <w:t xml:space="preserve"> E TERMINI DI PAGAMENTO </w:t>
-            </w:r>
-          </w:p>
-        </w:tc>
-        <w:tc>
-          <w:tcPr>
-            <w:tcW w:w="6573" w:type="dxa"/>
-            <w:tcBorders>
-              <w:top w:val="single" w:sz="4" w:space="0" w:color="000000"/>
-              <w:left w:val="single" w:sz="4" w:space="0" w:color="000000"/>
-              <w:bottom w:val="single" w:sz="4" w:space="0" w:color="000000"/>
-              <w:right w:val="single" w:sz="4" w:space="0" w:color="000000"/>
-            </w:tcBorders>
-          </w:tcPr>
-          <w:p>
-            <w:pPr>
-              <w:jc w:val="both"/>
-              <w:rPr>
-                <w:rFonts w:ascii="Century Gothic" w:hAnsi="Century Gothic" w:cs="Century Gothic"/>
-                <w:sz w:val="22"/>
-                <w:szCs w:val="22"/>
-              </w:rPr>
-            </w:pPr>
-            <w:r>
-              <w:rPr>
-                <w:rFonts w:ascii="Century Gothic" w:hAnsi="Century Gothic" w:cs="Century Gothic"/>
-                <w:sz w:val="22"/>
-                <w:szCs w:val="22"/>
-              </w:rPr>
-              <w:t>Bonifico Bancario Anticipato</w:t>
-            </w:r>
-          </w:p>
-        </w:tc>
-      </w:tr>
-      <w:tr>
-        <w:trPr>
-          <w:trHeight w:val="242"/>
-          <w:jc w:val="center"/>
-        </w:trPr>
-        <w:tc>
-          <w:tcPr>
-            <w:tcW w:w="4226" w:type="dxa"/>
-            <w:tcBorders>
-              <w:top w:val="single" w:sz="4" w:space="0" w:color="000000"/>
-              <w:left w:val="single" w:sz="4" w:space="0" w:color="000000"/>
-              <w:bottom w:val="single" w:sz="4" w:space="0" w:color="000000"/>
-              <w:right w:val="single" w:sz="4" w:space="0" w:color="000000"/>
-            </w:tcBorders>
-          </w:tcPr>
-          <w:p>
-            <w:pPr>
-              <w:jc w:val="both"/>
-              <w:rPr>
-                <w:rFonts w:ascii="Century Gothic" w:hAnsi="Century Gothic" w:cs="Century Gothic"/>
-                <w:caps/>
-                <w:sz w:val="22"/>
-                <w:szCs w:val="22"/>
-              </w:rPr>
-            </w:pPr>
-            <w:r>
-              <w:rPr>
-                <w:rFonts w:ascii="Century Gothic" w:hAnsi="Century Gothic" w:cs="Century Gothic"/>
-                <w:caps/>
-                <w:sz w:val="22"/>
-                <w:szCs w:val="22"/>
-              </w:rPr>
-              <w:t>Riferimenti bancari</w:t>
-            </w:r>
-          </w:p>
-        </w:tc>
-        <w:tc>
-          <w:tcPr>
-            <w:tcW w:w="6573" w:type="dxa"/>
-            <w:tcBorders>
-              <w:top w:val="single" w:sz="4" w:space="0" w:color="000000"/>
-              <w:left w:val="single" w:sz="4" w:space="0" w:color="000000"/>
-              <w:bottom w:val="single" w:sz="4" w:space="0" w:color="000000"/>
-              <w:right w:val="single" w:sz="4" w:space="0" w:color="000000"/>
-            </w:tcBorders>
-          </w:tcPr>
-          <w:p>
-            <w:pPr>
-              <w:rPr>
-                <w:rFonts w:ascii="Century Gothic" w:hAnsi="Century Gothic" w:cs="Century Gothic"/>
-                <w:sz w:val="22"/>
-                <w:szCs w:val="22"/>
-              </w:rPr>
-            </w:pPr>
-            <w:r>
-              <w:rPr>
-                <w:rFonts w:ascii="Century Gothic" w:hAnsi="Century Gothic" w:cs="Century Gothic"/>
-                <w:sz w:val="22"/>
-                <w:szCs w:val="22"/>
-              </w:rPr>
-              <w:t xml:space="preserve">Beneficiario : VALET SRL </w:t>
-            </w:r>
-          </w:p>
-          <w:p>
-            <w:pPr>
-              <w:rPr>
-                <w:rFonts w:ascii="Century Gothic" w:hAnsi="Century Gothic" w:cs="Century Gothic"/>
-                <w:sz w:val="22"/>
-                <w:szCs w:val="22"/>
-              </w:rPr>
-            </w:pPr>
-          </w:p>
-          <w:p>
-            <w:pPr>
-              <w:rPr>
-                <w:rFonts w:ascii="Century Gothic" w:hAnsi="Century Gothic" w:cs="Century Gothic"/>
-                <w:sz w:val="22"/>
-                <w:szCs w:val="22"/>
-              </w:rPr>
-            </w:pPr>
-            <w:r>
-              <w:rPr>
-                <w:rFonts w:ascii="Century Gothic" w:hAnsi="Century Gothic" w:cs="Century Gothic"/>
-                <w:sz w:val="22"/>
-                <w:szCs w:val="22"/>
-              </w:rPr>
-              <w:t xml:space="preserve">Banca : INTESA SAN PAOLO – </w:t>
-            </w:r>
-          </w:p>
-          <w:p>
-            <w:pPr>
-              <w:rPr>
-                <w:rFonts w:ascii="Century Gothic" w:hAnsi="Century Gothic" w:cs="Century Gothic"/>
-                <w:sz w:val="22"/>
-                <w:szCs w:val="22"/>
-              </w:rPr>
-            </w:pPr>
-            <w:r>
-              <w:rPr>
-                <w:rFonts w:ascii="Century Gothic" w:hAnsi="Century Gothic" w:cs="Century Gothic"/>
-                <w:sz w:val="22"/>
-                <w:szCs w:val="22"/>
-              </w:rPr>
-              <w:t>Agenzia di Via Marconi 51  Bologna (BO)</w:t>
-            </w:r>
-          </w:p>
-          <w:p>
-            <w:pPr>
-              <w:rPr>
-                <w:rFonts w:ascii="Century Gothic" w:hAnsi="Century Gothic" w:cs="Century Gothic"/>
-                <w:sz w:val="22"/>
-                <w:szCs w:val="22"/>
-                <w:lang w:val="en-GB"/>
-              </w:rPr>
-            </w:pPr>
-            <w:proofErr w:type="gramStart"/>
-            <w:r>
-              <w:rPr>
-                <w:rFonts w:ascii="Century Gothic" w:hAnsi="Century Gothic" w:cs="Century Gothic"/>
-                <w:sz w:val="22"/>
-                <w:szCs w:val="22"/>
-                <w:lang w:val="en-GB"/>
-              </w:rPr>
-              <w:t>IBAN :</w:t>
-            </w:r>
-            <w:proofErr w:type="gramEnd"/>
-            <w:r>
-              <w:rPr>
-                <w:rFonts w:ascii="Century Gothic" w:hAnsi="Century Gothic" w:cs="Century Gothic"/>
-                <w:sz w:val="22"/>
-                <w:szCs w:val="22"/>
-                <w:lang w:val="en-GB"/>
-              </w:rPr>
-              <w:t xml:space="preserve"> IT37 A030 6902 5201 0000 0011 856 BIC: BCITITMM </w:t>
-            </w:r>
-          </w:p>
-          <w:p>
-            <w:pPr>
-              <w:autoSpaceDE w:val="0"/>
-              <w:rPr>
-                <w:rFonts w:ascii="Century Gothic" w:hAnsi="Century Gothic" w:cs="Century Gothic"/>
-                <w:sz w:val="22"/>
-                <w:szCs w:val="22"/>
-                <w:lang w:val="en-GB"/>
-              </w:rPr>
-            </w:pPr>
-          </w:p>
-        </w:tc>
-      </w:tr>
-      <w:tr>
-        <w:trPr>
-          <w:trHeight w:val="242"/>
-          <w:jc w:val="center"/>
-        </w:trPr>
-        <w:tc>
-          <w:tcPr>
-            <w:tcW w:w="4226" w:type="dxa"/>
-            <w:tcBorders>
-              <w:top w:val="single" w:sz="4" w:space="0" w:color="000000"/>
-              <w:left w:val="single" w:sz="4" w:space="0" w:color="000000"/>
-              <w:bottom w:val="single" w:sz="4" w:space="0" w:color="000000"/>
-              <w:right w:val="single" w:sz="4" w:space="0" w:color="000000"/>
-            </w:tcBorders>
-          </w:tcPr>
-          <w:p>
-            <w:pPr>
-              <w:jc w:val="both"/>
-              <w:rPr>
-                <w:rFonts w:ascii="Century Gothic" w:hAnsi="Century Gothic" w:cs="Century Gothic"/>
-                <w:caps/>
-                <w:sz w:val="22"/>
-                <w:szCs w:val="22"/>
-              </w:rPr>
-            </w:pPr>
-            <w:r>
-              <w:rPr>
-                <w:rFonts w:ascii="Century Gothic" w:hAnsi="Century Gothic" w:cs="Century Gothic"/>
-                <w:caps/>
-                <w:sz w:val="22"/>
-                <w:szCs w:val="22"/>
-              </w:rPr>
-              <w:t>TERMINI DI CANCELLAZIONE</w:t>
-            </w:r>
-          </w:p>
-        </w:tc>
-        <w:tc>
-          <w:tcPr>
-            <w:tcW w:w="6573" w:type="dxa"/>
-            <w:tcBorders>
-              <w:top w:val="single" w:sz="4" w:space="0" w:color="000000"/>
-              <w:left w:val="single" w:sz="4" w:space="0" w:color="000000"/>
-              <w:bottom w:val="single" w:sz="4" w:space="0" w:color="000000"/>
-              <w:right w:val="single" w:sz="4" w:space="0" w:color="000000"/>
-            </w:tcBorders>
-          </w:tcPr>
-          <w:p>
-            <w:pPr>
-              <w:autoSpaceDE w:val="0"/>
-            </w:pPr>
-            <w:r>
-              <w:rPr>
-                <w:rFonts w:ascii="Century Gothic" w:hAnsi="Century Gothic" w:cs="Century Gothic"/>
-                <w:sz w:val="22"/>
-                <w:szCs w:val="22"/>
-              </w:rPr>
-              <w:t>Dalla data di conferma a 30 giorni prima dell’evento verrà restituito il 50% compenso concordato ; da 29 giorni prima dell’evento in poi, verrà trattenuto l’intero compenso.</w:t>
-            </w:r>
-          </w:p>
-        </w:tc>
-      </w:tr>
-    </w:tbl>
-    <w:p>
-      <w:pPr>
-        <w:jc w:val="both"/>
-        <w:rPr>
-          <w:rFonts w:ascii="Century Gothic" w:hAnsi="Century Gothic" w:cs="Century Gothic"/>
-          <w:sz w:val="22"/>
-          <w:szCs w:val="22"/>
-        </w:rPr>
-      </w:pPr>
-    </w:p>
-    <w:p>
-      <w:pPr>
-        <w:jc w:val="both"/>
-        <w:rPr>
-          <w:rFonts w:ascii="Century Gothic" w:hAnsi="Century Gothic" w:cs="Century Gothic"/>
-          <w:sz w:val="22"/>
-          <w:szCs w:val="22"/>
-        </w:rPr>
-      </w:pPr>
-    </w:p>
-    <w:p>
-      <w:pPr>
-        <w:jc w:val="both"/>
-        <w:rPr>
-          <w:rFonts w:ascii="Century Gothic" w:hAnsi="Century Gothic" w:cs="Century Gothic"/>
-          <w:sz w:val="22"/>
-          <w:szCs w:val="22"/>
-          <w:lang w:val="en-US"/>
-        </w:rPr>
-      </w:pPr>
-      <w:proofErr w:type="gramStart"/>
-      <w:r>
-        <w:rPr>
-          <w:rFonts w:ascii="Century Gothic" w:hAnsi="Century Gothic" w:cs="Century Gothic"/>
-          <w:sz w:val="22"/>
-          <w:szCs w:val="22"/>
-          <w:lang w:val="en-US"/>
-        </w:rPr>
-        <w:t xml:space="preserve">{{ </w:t>
-      </w:r>
-      <w:proofErr w:type="spellStart"/>
-      <w:r>
-        <w:rPr>
-          <w:rFonts w:ascii="Century Gothic" w:hAnsi="Century Gothic" w:cs="Century Gothic"/>
-          <w:sz w:val="22"/>
-          <w:szCs w:val="22"/>
-          <w:lang w:val="en-US"/>
-        </w:rPr>
-        <w:t>signature</w:t>
-      </w:r>
-      <w:proofErr w:type="gramEnd"/>
-      <w:r>
-        <w:rPr>
-          <w:rFonts w:ascii="Century Gothic" w:hAnsi="Century Gothic" w:cs="Century Gothic"/>
-          <w:sz w:val="22"/>
-          <w:szCs w:val="22"/>
-          <w:lang w:val="en-US"/>
-        </w:rPr>
-        <w:t>_place|</w:t>
-      </w:r>
-      <w:proofErr w:type="gramStart"/>
-      <w:r>
-        <w:rPr>
-          <w:rFonts w:ascii="Century Gothic" w:hAnsi="Century Gothic" w:cs="Century Gothic"/>
-          <w:sz w:val="22"/>
-          <w:szCs w:val="22"/>
-          <w:lang w:val="en-US"/>
-        </w:rPr>
-        <w:t>default</w:t>
-      </w:r>
-      <w:proofErr w:type="spellEnd"/>
-      <w:r>
-        <w:rPr>
-          <w:rFonts w:ascii="Century Gothic" w:hAnsi="Century Gothic" w:cs="Century Gothic"/>
-          <w:sz w:val="22"/>
-          <w:szCs w:val="22"/>
-          <w:lang w:val="en-US"/>
-        </w:rPr>
-        <w:t>(</w:t>
-      </w:r>
-      <w:proofErr w:type="gramEnd"/>
-      <w:r>
-        <w:rPr>
-          <w:rFonts w:ascii="Century Gothic" w:hAnsi="Century Gothic" w:cs="Century Gothic"/>
-          <w:sz w:val="22"/>
-          <w:szCs w:val="22"/>
-          <w:lang w:val="en-US"/>
-        </w:rPr>
-        <w:t>'Bologna', true</w:t>
-      </w:r>
-      <w:proofErr w:type="gramStart"/>
-      <w:r>
-        <w:rPr>
-          <w:rFonts w:ascii="Century Gothic" w:hAnsi="Century Gothic" w:cs="Century Gothic"/>
-          <w:sz w:val="22"/>
-          <w:szCs w:val="22"/>
-          <w:lang w:val="en-US"/>
-        </w:rPr>
-        <w:t>) }</w:t>
-      </w:r>
-      <w:proofErr w:type="gramEnd"/>
-      <w:r>
-        <w:rPr>
-          <w:rFonts w:ascii="Century Gothic" w:hAnsi="Century Gothic" w:cs="Century Gothic"/>
-          <w:sz w:val="22"/>
-          <w:szCs w:val="22"/>
-          <w:lang w:val="en-US"/>
-        </w:rPr>
-        <w:t xml:space="preserve">}, </w:t>
-      </w:r>
-      <w:proofErr w:type="spellStart"/>
-      <w:r>
-        <w:rPr>
-          <w:rFonts w:ascii="Century Gothic" w:hAnsi="Century Gothic" w:cs="Century Gothic"/>
-          <w:sz w:val="22"/>
-          <w:szCs w:val="22"/>
-          <w:lang w:val="en-US"/>
-        </w:rPr>
-        <w:t>lì</w:t>
-      </w:r>
-      <w:proofErr w:type="spellEnd"/>
-      <w:r>
-        <w:rPr>
-          <w:rFonts w:ascii="Century Gothic" w:hAnsi="Century Gothic" w:cs="Century Gothic"/>
-          <w:sz w:val="22"/>
-          <w:szCs w:val="22"/>
-          <w:lang w:val="en-US"/>
-        </w:rPr>
-        <w:t xml:space="preserve"> </w:t>
-      </w:r>
-      <w:proofErr w:type="gramStart"/>
-      <w:r>
-        <w:rPr>
-          <w:rFonts w:ascii="Century Gothic" w:hAnsi="Century Gothic" w:cs="Century Gothic"/>
-          <w:sz w:val="22"/>
-          <w:szCs w:val="22"/>
-          <w:lang w:val="en-US"/>
-        </w:rPr>
-        <w:t xml:space="preserve">{{ </w:t>
-      </w:r>
-      <w:proofErr w:type="spellStart"/>
-      <w:r>
-        <w:rPr>
-          <w:rFonts w:ascii="Century Gothic" w:hAnsi="Century Gothic" w:cs="Century Gothic"/>
-          <w:sz w:val="22"/>
-          <w:szCs w:val="22"/>
-          <w:lang w:val="en-US"/>
-        </w:rPr>
-        <w:t>contract</w:t>
-      </w:r>
-      <w:proofErr w:type="gramEnd"/>
-      <w:r>
-        <w:rPr>
-          <w:rFonts w:ascii="Century Gothic" w:hAnsi="Century Gothic" w:cs="Century Gothic"/>
-          <w:sz w:val="22"/>
-          <w:szCs w:val="22"/>
-          <w:lang w:val="en-US"/>
-        </w:rPr>
-        <w:t>.signed_date|format_date|</w:t>
-      </w:r>
-      <w:proofErr w:type="gramStart"/>
-      <w:r>
-        <w:rPr>
-          <w:rFonts w:ascii="Century Gothic" w:hAnsi="Century Gothic" w:cs="Century Gothic"/>
-          <w:sz w:val="22"/>
-          <w:szCs w:val="22"/>
-          <w:lang w:val="en-US"/>
-        </w:rPr>
-        <w:t>default</w:t>
-      </w:r>
-      <w:proofErr w:type="spellEnd"/>
-      <w:r>
-        <w:rPr>
-          <w:rFonts w:ascii="Century Gothic" w:hAnsi="Century Gothic" w:cs="Century Gothic"/>
-          <w:sz w:val="22"/>
-          <w:szCs w:val="22"/>
-          <w:lang w:val="en-US"/>
-        </w:rPr>
-        <w:t>(</w:t>
-      </w:r>
-      <w:proofErr w:type="gramEnd"/>
-      <w:r>
-        <w:rPr>
-          <w:rFonts w:ascii="Century Gothic" w:hAnsi="Century Gothic" w:cs="Century Gothic"/>
-          <w:sz w:val="22"/>
-          <w:szCs w:val="22"/>
-          <w:lang w:val="en-US"/>
-        </w:rPr>
-        <w:t>'___________', true</w:t>
-      </w:r>
-      <w:proofErr w:type="gramStart"/>
-      <w:r>
-        <w:rPr>
-          <w:rFonts w:ascii="Century Gothic" w:hAnsi="Century Gothic" w:cs="Century Gothic"/>
-          <w:sz w:val="22"/>
-          <w:szCs w:val="22"/>
-          <w:lang w:val="en-US"/>
-        </w:rPr>
-        <w:t>) }</w:t>
-      </w:r>
-      <w:proofErr w:type="gramEnd"/>
-      <w:r>
-        <w:rPr>
-          <w:rFonts w:ascii="Century Gothic" w:hAnsi="Century Gothic" w:cs="Century Gothic"/>
-          <w:sz w:val="22"/>
-          <w:szCs w:val="22"/>
-          <w:lang w:val="en-US"/>
-        </w:rPr>
-        <w:t xml:space="preserve">} </w:t>
-      </w:r>
-    </w:p>
-    <w:p>
-      <w:pPr>
-        <w:jc w:val="both"/>
-        <w:rPr>
-          <w:rFonts w:ascii="Century Gothic" w:hAnsi="Century Gothic" w:cs="Century Gothic"/>
-          <w:i/>
-          <w:sz w:val="22"/>
-          <w:szCs w:val="22"/>
-          <w:lang w:val="en-US"/>
-        </w:rPr>
-      </w:pPr>
-    </w:p>
-    <w:p>
-      <w:pPr>
-        <w:rPr>
-          <w:rFonts w:ascii="Century Gothic" w:hAnsi="Century Gothic" w:cs="Century Gothic"/>
-          <w:b/>
-          <w:bCs/>
-          <w:i/>
-          <w:sz w:val="22"/>
-          <w:szCs w:val="22"/>
-          <w:lang w:val="en-US"/>
-        </w:rPr>
-      </w:pPr>
-    </w:p>
-    <w:p>
-      <w:pPr>
-        <w:rPr>
-          <w:rFonts w:ascii="Century Gothic" w:hAnsi="Century Gothic" w:cs="Century Gothic"/>
-          <w:b/>
-          <w:bCs/>
-          <w:sz w:val="22"/>
-          <w:szCs w:val="22"/>
-          <w:lang w:val="en-US"/>
-        </w:rPr>
-      </w:pPr>
-    </w:p>
-    <w:p>
-      <w:r>
-        <w:rPr>
-          <w:rFonts w:ascii="Century Gothic" w:hAnsi="Century Gothic" w:cs="Century Gothic"/>
-          <w:b/>
-          <w:bCs/>
-          <w:sz w:val="22"/>
-          <w:szCs w:val="22"/>
-        </w:rPr>
-        <w:t xml:space="preserve">Segreteria Organizzativa: </w:t>
-      </w:r>
-      <w:r>
-        <w:rPr>
-          <w:rFonts w:ascii="Century Gothic" w:hAnsi="Century Gothic" w:cs="Century Gothic"/>
-          <w:b/>
-          <w:bCs/>
-          <w:sz w:val="22"/>
-          <w:szCs w:val="22"/>
-        </w:rPr>
-        <w:tab/>
-      </w:r>
-      <w:r>
-        <w:rPr>
-          <w:rFonts w:ascii="Century Gothic" w:hAnsi="Century Gothic" w:cs="Century Gothic"/>
-          <w:b/>
-          <w:bCs/>
-          <w:sz w:val="22"/>
-          <w:szCs w:val="22"/>
-        </w:rPr>
-        <w:tab/>
-      </w:r>
-      <w:r>
-        <w:rPr>
-          <w:rFonts w:ascii="Century Gothic" w:hAnsi="Century Gothic" w:cs="Century Gothic"/>
-          <w:b/>
-          <w:bCs/>
-          <w:sz w:val="22"/>
-          <w:szCs w:val="22"/>
-        </w:rPr>
-        <w:tab/>
-      </w:r>
-      <w:r>
-        <w:rPr>
-          <w:rFonts w:ascii="Century Gothic" w:hAnsi="Century Gothic" w:cs="Century Gothic"/>
-          <w:b/>
-          <w:bCs/>
-          <w:sz w:val="22"/>
-          <w:szCs w:val="22"/>
-        </w:rPr>
-        <w:tab/>
-      </w:r>
-      <w:r>
-        <w:rPr>
-          <w:rFonts w:ascii="Century Gothic" w:hAnsi="Century Gothic" w:cs="Century Gothic"/>
-          <w:b/>
-          <w:bCs/>
-          <w:sz w:val="22"/>
-          <w:szCs w:val="22"/>
-        </w:rPr>
-        <w:tab/>
-      </w:r>
-      <w:r>
-        <w:rPr>
-          <w:rFonts w:ascii="Century Gothic" w:hAnsi="Century Gothic" w:cs="Century Gothic"/>
-          <w:b/>
-          <w:bCs/>
-          <w:sz w:val="22"/>
-          <w:szCs w:val="22"/>
-        </w:rPr>
-        <w:tab/>
-      </w:r>
-      <w:r>
-        <w:rPr>
-          <w:rFonts w:ascii="Century Gothic" w:hAnsi="Century Gothic" w:cs="Century Gothic"/>
-          <w:b/>
-          <w:bCs/>
-          <w:sz w:val="22"/>
-          <w:szCs w:val="22"/>
-        </w:rPr>
-        <w:tab/>
-      </w:r>
-      <w:r>
-        <w:rPr>
-          <w:rFonts w:ascii="Century Gothic" w:hAnsi="Century Gothic" w:cs="Century Gothic"/>
-          <w:b/>
-          <w:bCs/>
-          <w:sz w:val="22"/>
-          <w:szCs w:val="22"/>
-        </w:rPr>
-        <w:t>Lo Sponsor</w:t>
-      </w:r>
-      <w:r>
-        <w:rPr>
-          <w:rFonts w:ascii="Century Gothic" w:hAnsi="Century Gothic" w:cs="Century Gothic"/>
-          <w:sz w:val="22"/>
-          <w:szCs w:val="22"/>
-        </w:rPr>
-        <w:t xml:space="preserve"> </w:t>
-      </w:r>
-    </w:p>
-    <w:p>
-      <w:pPr>
-        <w:jc w:val="both"/>
-        <w:rPr>
-          <w:rFonts w:ascii="Century Gothic" w:hAnsi="Century Gothic" w:cs="Century Gothic"/>
-          <w:sz w:val="22"/>
-          <w:szCs w:val="22"/>
-        </w:rPr>
-      </w:pPr>
-      <w:r>
-        <w:rPr>
-          <w:rFonts w:ascii="Century Gothic" w:hAnsi="Century Gothic" w:cs="Century Gothic"/>
-          <w:sz w:val="22"/>
-          <w:szCs w:val="22"/>
-        </w:rPr>
-        <w:t xml:space="preserve">VALET SRL </w:t>
-      </w:r>
-      <w:r>
-        <w:rPr>
-          <w:rFonts w:ascii="Century Gothic" w:hAnsi="Century Gothic" w:cs="Century Gothic"/>
-          <w:sz w:val="22"/>
-          <w:szCs w:val="22"/>
-        </w:rPr>
-        <w:tab/>
-      </w:r>
-      <w:r>
-        <w:rPr>
-          <w:rFonts w:ascii="Century Gothic" w:hAnsi="Century Gothic" w:cs="Century Gothic"/>
-          <w:sz w:val="22"/>
-          <w:szCs w:val="22"/>
-        </w:rPr>
-        <w:tab/>
-      </w:r>
-      <w:r>
-        <w:rPr>
-          <w:rFonts w:ascii="Century Gothic" w:hAnsi="Century Gothic" w:cs="Century Gothic"/>
-          <w:sz w:val="22"/>
-          <w:szCs w:val="22"/>
-        </w:rPr>
-        <w:tab/>
-      </w:r>
-      <w:r>
-        <w:rPr>
-          <w:rFonts w:ascii="Century Gothic" w:hAnsi="Century Gothic" w:cs="Century Gothic"/>
-          <w:sz w:val="22"/>
-          <w:szCs w:val="22"/>
-        </w:rPr>
-        <w:tab/>
-      </w:r>
-      <w:r>
-        <w:rPr>
-          <w:rFonts w:ascii="Century Gothic" w:hAnsi="Century Gothic" w:cs="Century Gothic"/>
-          <w:sz w:val="22"/>
-          <w:szCs w:val="22"/>
-        </w:rPr>
-        <w:tab/>
-      </w:r>
-      <w:r>
-        <w:rPr>
-          <w:rFonts w:ascii="Century Gothic" w:hAnsi="Century Gothic" w:cs="Century Gothic"/>
-          <w:sz w:val="22"/>
-          <w:szCs w:val="22"/>
-        </w:rPr>
-        <w:tab/>
-      </w:r>
-      <w:r>
-        <w:rPr>
-          <w:rFonts w:ascii="Century Gothic" w:hAnsi="Century Gothic" w:cs="Century Gothic"/>
-          <w:sz w:val="22"/>
-          <w:szCs w:val="22"/>
-        </w:rPr>
-        <w:tab/>
-      </w:r>
-      <w:r>
-        <w:rPr>
-          <w:rFonts w:ascii="Century Gothic" w:hAnsi="Century Gothic" w:cs="Century Gothic"/>
-          <w:sz w:val="22"/>
-          <w:szCs w:val="22"/>
-        </w:rPr>
-        <w:tab/>
-      </w:r>
-      <w:r>
-        <w:rPr>
-          <w:rFonts w:ascii="Century Gothic" w:hAnsi="Century Gothic" w:cs="Century Gothic"/>
-          <w:sz w:val="22"/>
-          <w:szCs w:val="22"/>
-        </w:rPr>
-        <w:tab/>
-        <w:t>___________________</w:t>
-      </w:r>
-    </w:p>
-    <w:p>
-      <w:pPr>
-        <w:jc w:val="both"/>
-        <w:rPr>
-          <w:rFonts w:ascii="Century Gothic" w:hAnsi="Century Gothic" w:cs="Century Gothic"/>
-          <w:sz w:val="22"/>
-          <w:szCs w:val="22"/>
-        </w:rPr>
-      </w:pPr>
-      <w:r>
-        <w:rPr>
-          <w:rFonts w:ascii="Century Gothic" w:hAnsi="Century Gothic" w:cs="Century Gothic"/>
-          <w:sz w:val="22"/>
-          <w:szCs w:val="22"/>
-        </w:rPr>
-        <w:t>Il legale Rappresentate</w:t>
-      </w:r>
-      <w:r>
-        <w:rPr>
-          <w:rFonts w:ascii="Century Gothic" w:hAnsi="Century Gothic" w:cs="Century Gothic"/>
-          <w:sz w:val="22"/>
-          <w:szCs w:val="22"/>
-        </w:rPr>
-        <w:tab/>
-      </w:r>
-      <w:r>
-        <w:rPr>
-          <w:rFonts w:ascii="Century Gothic" w:hAnsi="Century Gothic" w:cs="Century Gothic"/>
-          <w:sz w:val="22"/>
-          <w:szCs w:val="22"/>
-        </w:rPr>
-        <w:tab/>
-      </w:r>
-      <w:r>
-        <w:rPr>
-          <w:rFonts w:ascii="Century Gothic" w:hAnsi="Century Gothic" w:cs="Century Gothic"/>
-          <w:sz w:val="22"/>
-          <w:szCs w:val="22"/>
-        </w:rPr>
-        <w:tab/>
-      </w:r>
-      <w:r>
-        <w:rPr>
-          <w:rFonts w:ascii="Century Gothic" w:hAnsi="Century Gothic" w:cs="Century Gothic"/>
-          <w:sz w:val="22"/>
-          <w:szCs w:val="22"/>
-        </w:rPr>
-        <w:tab/>
-      </w:r>
-      <w:r>
-        <w:rPr>
-          <w:rFonts w:ascii="Century Gothic" w:hAnsi="Century Gothic" w:cs="Century Gothic"/>
-          <w:sz w:val="22"/>
-          <w:szCs w:val="22"/>
-        </w:rPr>
-        <w:tab/>
-      </w:r>
-      <w:r>
-        <w:rPr>
-          <w:rFonts w:ascii="Century Gothic" w:hAnsi="Century Gothic" w:cs="Century Gothic"/>
-          <w:sz w:val="22"/>
-          <w:szCs w:val="22"/>
-        </w:rPr>
-        <w:tab/>
-      </w:r>
-      <w:r>
-        <w:rPr>
-          <w:rFonts w:ascii="Century Gothic" w:hAnsi="Century Gothic" w:cs="Century Gothic"/>
-          <w:sz w:val="22"/>
-          <w:szCs w:val="22"/>
-        </w:rPr>
-        <w:tab/>
-        <w:t>Legale Rappresentante</w:t>
-      </w:r>
-    </w:p>
-    <w:p>
-      <w:pPr>
-        <w:jc w:val="both"/>
-        <w:rPr>
-          <w:rFonts w:ascii="Century Gothic" w:hAnsi="Century Gothic" w:cs="Century Gothic"/>
-          <w:sz w:val="22"/>
-          <w:szCs w:val="22"/>
-        </w:rPr>
-      </w:pPr>
-      <w:r>
-        <w:rPr>
-          <w:noProof/>
-        </w:rPr>
-        <w:drawing>
-          <wp:anchor distT="0" distB="0" distL="114935" distR="114935" simplePos="0" relativeHeight="17" behindDoc="1" locked="0" layoutInCell="1" allowOverlap="1" wp14:anchorId="4A67278E" wp14:editId="72654022">
-            <wp:simplePos x="0" y="0"/>
-            <wp:positionH relativeFrom="column">
-              <wp:posOffset>6350</wp:posOffset>
-            </wp:positionH>
-            <wp:positionV relativeFrom="paragraph">
-              <wp:posOffset>82550</wp:posOffset>
-            </wp:positionV>
-            <wp:extent cx="1489710" cy="590550"/>
-            <wp:effectExtent l="0" t="0" r="0" b="0"/>
-            <wp:wrapNone/>
-            <wp:docPr id="2" name="Image2"/>
-            <wp:cNvGraphicFramePr>
-              <a:graphicFrameLocks xmlns:a="http://schemas.openxmlformats.org/drawingml/2006/main" noChangeAspect="1"/>
-            </wp:cNvGraphicFramePr>
-            <a:graphic xmlns:a="http://schemas.openxmlformats.org/drawingml/2006/main">
-              <a:graphicData uri="http://schemas.openxmlformats.org/drawingml/2006/picture">
-                <pic:pic xmlns:pic="http://schemas.openxmlformats.org/drawingml/2006/picture">
-                  <pic:nvPicPr>
-                    <pic:cNvPr id="2" name="Image2"/>
-                    <pic:cNvPicPr>
-                      <a:picLocks noChangeAspect="1" noChangeArrowheads="1"/>
-                    </pic:cNvPicPr>
-                  </pic:nvPicPr>
-                  <pic:blipFill>
-                    <a:blip r:embed="rId7"/>
-                    <a:srcRect l="-12" t="-31" r="-12" b="-31"/>
-                    <a:stretch>
-                      <a:fillRect/>
-                    </a:stretch>
-                  </pic:blipFill>
-                  <pic:spPr bwMode="auto">
-                    <a:xfrm>
-                      <a:off x="0" y="0"/>
-                      <a:ext cx="1489710" cy="590550"/>
-                    </a:xfrm>
-                    <a:prstGeom prst="rect">
-                      <a:avLst/>
-                    </a:prstGeom>
-                  </pic:spPr>
-                </pic:pic>
-              </a:graphicData>
-            </a:graphic>
-          </wp:anchor>
-        </w:drawing>
-      </w:r>
-      <w:r>
-        <w:rPr>
-          <w:rFonts w:ascii="Century Gothic" w:hAnsi="Century Gothic" w:cs="Century Gothic"/>
-          <w:sz w:val="22"/>
-          <w:szCs w:val="22"/>
-        </w:rPr>
-        <w:t>(Daniele Morini)</w:t>
-      </w:r>
-      <w:r>
-        <w:rPr>
-          <w:rFonts w:ascii="Century Gothic" w:hAnsi="Century Gothic" w:cs="Century Gothic"/>
-          <w:sz w:val="22"/>
-          <w:szCs w:val="22"/>
-        </w:rPr>
-        <w:tab/>
-      </w:r>
-      <w:r>
-        <w:rPr>
-          <w:rFonts w:ascii="Century Gothic" w:hAnsi="Century Gothic" w:cs="Century Gothic"/>
-          <w:sz w:val="22"/>
-          <w:szCs w:val="22"/>
-        </w:rPr>
-        <w:tab/>
-      </w:r>
-      <w:r>
-        <w:rPr>
-          <w:rFonts w:ascii="Century Gothic" w:hAnsi="Century Gothic" w:cs="Century Gothic"/>
-          <w:sz w:val="22"/>
-          <w:szCs w:val="22"/>
-        </w:rPr>
-        <w:tab/>
-      </w:r>
-      <w:r>
-        <w:rPr>
-          <w:rFonts w:ascii="Century Gothic" w:hAnsi="Century Gothic" w:cs="Century Gothic"/>
-          <w:sz w:val="22"/>
-          <w:szCs w:val="22"/>
-        </w:rPr>
-        <w:tab/>
-      </w:r>
-      <w:r>
-        <w:rPr>
-          <w:rFonts w:ascii="Century Gothic" w:hAnsi="Century Gothic" w:cs="Century Gothic"/>
-          <w:sz w:val="22"/>
-          <w:szCs w:val="22"/>
-        </w:rPr>
-        <w:tab/>
-      </w:r>
-      <w:r>
-        <w:rPr>
-          <w:rFonts w:ascii="Century Gothic" w:hAnsi="Century Gothic" w:cs="Century Gothic"/>
-          <w:sz w:val="22"/>
-          <w:szCs w:val="22"/>
-        </w:rPr>
-        <w:tab/>
-      </w:r>
-      <w:r>
-        <w:rPr>
-          <w:rFonts w:ascii="Century Gothic" w:hAnsi="Century Gothic" w:cs="Century Gothic"/>
-          <w:sz w:val="22"/>
-          <w:szCs w:val="22"/>
-        </w:rPr>
-        <w:tab/>
-      </w:r>
-      <w:r>
-        <w:rPr>
-          <w:rFonts w:ascii="Century Gothic" w:hAnsi="Century Gothic" w:cs="Century Gothic"/>
-          <w:sz w:val="22"/>
-          <w:szCs w:val="22"/>
-        </w:rPr>
-        <w:tab/>
-        <w:t>(___________________)</w:t>
-      </w:r>
-      <w:r>
-        <w:rPr>
-          <w:rFonts w:ascii="Century Gothic" w:hAnsi="Century Gothic" w:cs="Century Gothic"/>
-          <w:sz w:val="22"/>
-          <w:szCs w:val="22"/>
-        </w:rPr>
-        <w:tab/>
-      </w:r>
-    </w:p>
-    <w:p>
-      <w:pPr>
-        <w:jc w:val="both"/>
-      </w:pPr>
-      <w:r>
-        <w:rPr>
-          <w:rFonts w:ascii="Century Gothic" w:hAnsi="Century Gothic" w:cs="Century Gothic"/>
-          <w:sz w:val="22"/>
-          <w:szCs w:val="22"/>
-        </w:rPr>
-        <w:t xml:space="preserve">___________________ </w:t>
-      </w:r>
-      <w:r>
-        <w:rPr>
-          <w:rFonts w:ascii="Century Gothic" w:hAnsi="Century Gothic" w:cs="Century Gothic"/>
-          <w:sz w:val="22"/>
-          <w:szCs w:val="22"/>
-        </w:rPr>
-        <w:tab/>
-      </w:r>
-      <w:r>
-        <w:rPr>
-          <w:rFonts w:ascii="Century Gothic" w:hAnsi="Century Gothic" w:cs="Century Gothic"/>
-          <w:sz w:val="22"/>
-          <w:szCs w:val="22"/>
-        </w:rPr>
-        <w:tab/>
-      </w:r>
-      <w:r>
-        <w:rPr>
-          <w:rFonts w:ascii="Century Gothic" w:hAnsi="Century Gothic" w:cs="Century Gothic"/>
-          <w:sz w:val="22"/>
-          <w:szCs w:val="22"/>
-        </w:rPr>
-        <w:tab/>
-      </w:r>
-      <w:r>
-        <w:rPr>
-          <w:rFonts w:ascii="Century Gothic" w:hAnsi="Century Gothic" w:cs="Century Gothic"/>
-          <w:sz w:val="22"/>
-          <w:szCs w:val="22"/>
-        </w:rPr>
-        <w:tab/>
-      </w:r>
-      <w:r>
-        <w:rPr>
-          <w:rFonts w:ascii="Century Gothic" w:hAnsi="Century Gothic" w:cs="Century Gothic"/>
-          <w:sz w:val="22"/>
-          <w:szCs w:val="22"/>
-        </w:rPr>
-        <w:tab/>
-      </w:r>
-      <w:r>
-        <w:rPr>
-          <w:rFonts w:ascii="Century Gothic" w:hAnsi="Century Gothic" w:cs="Century Gothic"/>
-          <w:sz w:val="22"/>
-          <w:szCs w:val="22"/>
-        </w:rPr>
-        <w:tab/>
-      </w:r>
-      <w:r>
-        <w:rPr>
-          <w:rFonts w:ascii="Century Gothic" w:hAnsi="Century Gothic" w:cs="Century Gothic"/>
-          <w:sz w:val="22"/>
-          <w:szCs w:val="22"/>
-        </w:rPr>
-        <w:tab/>
-      </w:r>
-      <w:r>
-        <w:rPr>
-          <w:rFonts w:ascii="Century Gothic" w:hAnsi="Century Gothic" w:cs="Century Gothic"/>
-          <w:sz w:val="22"/>
-          <w:szCs w:val="22"/>
-        </w:rPr>
-        <w:tab/>
-      </w:r>
     </w:p>
     <w:sectPr>
       <w:headerReference w:type="default" r:id="rId10"/>

</xml_diff>